<commit_message>
feat(game): Add Surround game v22.0.0 - dual-direction defense with Hunter Snake boss
New two-lane center-defense game with dual-direction snake attacks, egg/hatch
mechanics, and two game modes. Mode 1 is timed arcade scoring. Mode 2 is
objective-based survival featuring Hunter Snake boss with directional damage,
mid-field turns, and projectile attacks.

- Player marker with smooth movement and fade transitions
- Snakes spawn from both ends, pass through each other, create eggs on tail overlap
- Eggs hatch into baby snakes or transform normal snakes into Hunters
- Hunter Snake: U-turns, fires projectiles, separate front/rear damage counters
- Console mode toggle button for games with multiple modes
- Separate config files per mode with extensive tuning parameters
</commit_message>
<xml_diff>
--- a/Surround_Game_Design_Specification.docx
+++ b/Surround_Game_Design_Specification.docx
@@ -7944,6 +7944,138 @@
     </w:p>
     <w:p>
       <w:pPr>
+        <w:pStyle w:val="BodyText"/>
+        <w:spacing w:after="0"/>
+      </w:pPr>
+    </w:p>
+    <w:p>
+      <w:pPr>
+        <w:pStyle w:val="BodyText"/>
+        <w:spacing w:after="0"/>
+      </w:pPr>
+    </w:p>
+    <w:p>
+      <w:pPr>
+        <w:pStyle w:val="BodyText"/>
+        <w:spacing w:after="0"/>
+      </w:pPr>
+    </w:p>
+    <w:p>
+      <w:pPr>
+        <w:pStyle w:val="BodyText"/>
+        <w:spacing w:after="0"/>
+      </w:pPr>
+    </w:p>
+    <w:p>
+      <w:pPr>
+        <w:pStyle w:val="BodyText"/>
+        <w:spacing w:after="0"/>
+      </w:pPr>
+    </w:p>
+    <w:p>
+      <w:pPr>
+        <w:pStyle w:val="BodyText"/>
+        <w:spacing w:after="0"/>
+      </w:pPr>
+    </w:p>
+    <w:p>
+      <w:pPr>
+        <w:pStyle w:val="BodyText"/>
+        <w:spacing w:after="0"/>
+      </w:pPr>
+    </w:p>
+    <w:p>
+      <w:pPr>
+        <w:pStyle w:val="BodyText"/>
+        <w:spacing w:after="0"/>
+      </w:pPr>
+    </w:p>
+    <w:p>
+      <w:pPr>
+        <w:pStyle w:val="BodyText"/>
+        <w:spacing w:after="0"/>
+      </w:pPr>
+    </w:p>
+    <w:p>
+      <w:pPr>
+        <w:pStyle w:val="BodyText"/>
+        <w:spacing w:after="0"/>
+      </w:pPr>
+    </w:p>
+    <w:p>
+      <w:pPr>
+        <w:pStyle w:val="BodyText"/>
+        <w:spacing w:after="0"/>
+      </w:pPr>
+    </w:p>
+    <w:p>
+      <w:pPr>
+        <w:pStyle w:val="BodyText"/>
+        <w:spacing w:after="0"/>
+      </w:pPr>
+    </w:p>
+    <w:p>
+      <w:pPr>
+        <w:pStyle w:val="BodyText"/>
+        <w:spacing w:after="0"/>
+      </w:pPr>
+    </w:p>
+    <w:p>
+      <w:pPr>
+        <w:pStyle w:val="BodyText"/>
+        <w:spacing w:after="0"/>
+      </w:pPr>
+    </w:p>
+    <w:p>
+      <w:pPr>
+        <w:pStyle w:val="BodyText"/>
+        <w:spacing w:after="0"/>
+      </w:pPr>
+    </w:p>
+    <w:p>
+      <w:pPr>
+        <w:pStyle w:val="BodyText"/>
+        <w:spacing w:after="0"/>
+      </w:pPr>
+    </w:p>
+    <w:p>
+      <w:pPr>
+        <w:pStyle w:val="BodyText"/>
+        <w:spacing w:after="0"/>
+      </w:pPr>
+    </w:p>
+    <w:p>
+      <w:pPr>
+        <w:pStyle w:val="BodyText"/>
+        <w:spacing w:after="0"/>
+      </w:pPr>
+    </w:p>
+    <w:p>
+      <w:pPr>
+        <w:pStyle w:val="BodyText"/>
+        <w:spacing w:after="0"/>
+      </w:pPr>
+    </w:p>
+    <w:p>
+      <w:pPr>
+        <w:pStyle w:val="BodyText"/>
+        <w:spacing w:after="0"/>
+      </w:pPr>
+    </w:p>
+    <w:p>
+      <w:pPr>
+        <w:pStyle w:val="BodyText"/>
+        <w:spacing w:after="0"/>
+      </w:pPr>
+    </w:p>
+    <w:p>
+      <w:pPr>
+        <w:pStyle w:val="BodyText"/>
+        <w:spacing w:after="0"/>
+      </w:pPr>
+    </w:p>
+    <w:p>
+      <w:pPr>
         <w:jc w:val="center"/>
         <w:rPr>
           <w:sz w:val="40"/>
@@ -8559,22 +8691,2703 @@
     </w:p>
     <w:p/>
     <w:p/>
+    <w:p>
+      <w:pPr>
+        <w:jc w:val="center"/>
+        <w:rPr>
+          <w:b/>
+          <w:bCs/>
+          <w:sz w:val="40"/>
+          <w:szCs w:val="40"/>
+        </w:rPr>
+      </w:pPr>
+      <w:r>
+        <w:rPr>
+          <w:b/>
+          <w:bCs/>
+          <w:sz w:val="40"/>
+          <w:szCs w:val="40"/>
+        </w:rPr>
+        <w:t>Surround v22.0.0 - Implementation Summary</w:t>
+      </w:r>
+    </w:p>
+    <w:p>
+      <w:pPr>
+        <w:jc w:val="center"/>
+        <w:rPr>
+          <w:b/>
+          <w:bCs/>
+          <w:sz w:val="40"/>
+          <w:szCs w:val="40"/>
+        </w:rPr>
+      </w:pPr>
+    </w:p>
+    <w:p>
+      <w:pPr>
+        <w:jc w:val="center"/>
+        <w:rPr>
+          <w:b/>
+          <w:bCs/>
+          <w:sz w:val="40"/>
+          <w:szCs w:val="40"/>
+        </w:rPr>
+      </w:pPr>
+    </w:p>
+    <w:p>
+      <w:pPr>
+        <w:rPr>
+          <w:b/>
+          <w:bCs/>
+        </w:rPr>
+      </w:pPr>
+      <w:r>
+        <w:rPr>
+          <w:b/>
+          <w:bCs/>
+        </w:rPr>
+        <w:t>Core Mechanics Confirmed</w:t>
+      </w:r>
+    </w:p>
+    <w:tbl>
+      <w:tblPr>
+        <w:tblW w:w="0" w:type="auto"/>
+        <w:shd w:val="clear" w:color="auto" w:fill="0D1117"/>
+        <w:tblCellMar>
+          <w:top w:w="15" w:type="dxa"/>
+          <w:left w:w="15" w:type="dxa"/>
+          <w:bottom w:w="15" w:type="dxa"/>
+          <w:right w:w="15" w:type="dxa"/>
+        </w:tblCellMar>
+        <w:tblLook w:val="04A0" w:firstRow="1" w:lastRow="0" w:firstColumn="1" w:lastColumn="0" w:noHBand="0" w:noVBand="1"/>
+      </w:tblPr>
+      <w:tblGrid>
+        <w:gridCol w:w="1578"/>
+        <w:gridCol w:w="8604"/>
+      </w:tblGrid>
+      <w:tr>
+        <w:trPr>
+          <w:tblHeader/>
+        </w:trPr>
+        <w:tc>
+          <w:tcPr>
+            <w:tcW w:w="0" w:type="auto"/>
+            <w:tcBorders>
+              <w:top w:val="single" w:sz="4" w:space="0" w:color="3D444D"/>
+              <w:left w:val="single" w:sz="4" w:space="0" w:color="3D444D"/>
+              <w:bottom w:val="single" w:sz="4" w:space="0" w:color="3D444D"/>
+              <w:right w:val="single" w:sz="4" w:space="0" w:color="3D444D"/>
+            </w:tcBorders>
+            <w:shd w:val="clear" w:color="auto" w:fill="0D1117"/>
+            <w:tcMar>
+              <w:top w:w="90" w:type="dxa"/>
+              <w:left w:w="195" w:type="dxa"/>
+              <w:bottom w:w="90" w:type="dxa"/>
+              <w:right w:w="195" w:type="dxa"/>
+            </w:tcMar>
+            <w:vAlign w:val="center"/>
+            <w:hideMark/>
+          </w:tcPr>
+          <w:p>
+            <w:pPr>
+              <w:rPr>
+                <w:b/>
+                <w:bCs/>
+              </w:rPr>
+            </w:pPr>
+            <w:r>
+              <w:rPr>
+                <w:b/>
+                <w:bCs/>
+              </w:rPr>
+              <w:t>Mechanic</w:t>
+            </w:r>
+          </w:p>
+        </w:tc>
+        <w:tc>
+          <w:tcPr>
+            <w:tcW w:w="0" w:type="auto"/>
+            <w:tcBorders>
+              <w:top w:val="single" w:sz="4" w:space="0" w:color="3D444D"/>
+              <w:left w:val="single" w:sz="4" w:space="0" w:color="3D444D"/>
+              <w:bottom w:val="single" w:sz="4" w:space="0" w:color="3D444D"/>
+              <w:right w:val="single" w:sz="4" w:space="0" w:color="3D444D"/>
+            </w:tcBorders>
+            <w:shd w:val="clear" w:color="auto" w:fill="0D1117"/>
+            <w:tcMar>
+              <w:top w:w="90" w:type="dxa"/>
+              <w:left w:w="195" w:type="dxa"/>
+              <w:bottom w:w="90" w:type="dxa"/>
+              <w:right w:w="195" w:type="dxa"/>
+            </w:tcMar>
+            <w:vAlign w:val="center"/>
+            <w:hideMark/>
+          </w:tcPr>
+          <w:p>
+            <w:pPr>
+              <w:rPr>
+                <w:b/>
+                <w:bCs/>
+              </w:rPr>
+            </w:pPr>
+            <w:r>
+              <w:rPr>
+                <w:b/>
+                <w:bCs/>
+              </w:rPr>
+              <w:t>Behavior</w:t>
+            </w:r>
+          </w:p>
+        </w:tc>
+      </w:tr>
+      <w:tr>
+        <w:tc>
+          <w:tcPr>
+            <w:tcW w:w="0" w:type="auto"/>
+            <w:tcBorders>
+              <w:top w:val="single" w:sz="4" w:space="0" w:color="3D444D"/>
+              <w:left w:val="single" w:sz="4" w:space="0" w:color="3D444D"/>
+              <w:bottom w:val="single" w:sz="4" w:space="0" w:color="3D444D"/>
+              <w:right w:val="single" w:sz="4" w:space="0" w:color="3D444D"/>
+            </w:tcBorders>
+            <w:shd w:val="clear" w:color="auto" w:fill="0D1117"/>
+            <w:tcMar>
+              <w:top w:w="90" w:type="dxa"/>
+              <w:left w:w="195" w:type="dxa"/>
+              <w:bottom w:w="90" w:type="dxa"/>
+              <w:right w:w="195" w:type="dxa"/>
+            </w:tcMar>
+            <w:vAlign w:val="center"/>
+            <w:hideMark/>
+          </w:tcPr>
+          <w:p>
+            <w:r>
+              <w:rPr>
+                <w:b/>
+                <w:bCs/>
+              </w:rPr>
+              <w:t>Player Marker</w:t>
+            </w:r>
+          </w:p>
+        </w:tc>
+        <w:tc>
+          <w:tcPr>
+            <w:tcW w:w="0" w:type="auto"/>
+            <w:tcBorders>
+              <w:top w:val="single" w:sz="4" w:space="0" w:color="3D444D"/>
+              <w:left w:val="single" w:sz="4" w:space="0" w:color="3D444D"/>
+              <w:bottom w:val="single" w:sz="4" w:space="0" w:color="3D444D"/>
+              <w:right w:val="single" w:sz="4" w:space="0" w:color="3D444D"/>
+            </w:tcBorders>
+            <w:shd w:val="clear" w:color="auto" w:fill="0D1117"/>
+            <w:tcMar>
+              <w:top w:w="90" w:type="dxa"/>
+              <w:left w:w="195" w:type="dxa"/>
+              <w:bottom w:w="90" w:type="dxa"/>
+              <w:right w:w="195" w:type="dxa"/>
+            </w:tcMar>
+            <w:vAlign w:val="center"/>
+            <w:hideMark/>
+          </w:tcPr>
+          <w:p>
+            <w:r>
+              <w:t>3-5 contiguous white pixels (center can be colored for 6+ lives), starts at pixels 49-51</w:t>
+            </w:r>
+          </w:p>
+        </w:tc>
+      </w:tr>
+      <w:tr>
+        <w:tc>
+          <w:tcPr>
+            <w:tcW w:w="0" w:type="auto"/>
+            <w:tcBorders>
+              <w:top w:val="single" w:sz="4" w:space="0" w:color="3D444D"/>
+              <w:left w:val="single" w:sz="4" w:space="0" w:color="3D444D"/>
+              <w:bottom w:val="single" w:sz="4" w:space="0" w:color="3D444D"/>
+              <w:right w:val="single" w:sz="4" w:space="0" w:color="3D444D"/>
+            </w:tcBorders>
+            <w:shd w:val="clear" w:color="auto" w:fill="151B23"/>
+            <w:tcMar>
+              <w:top w:w="90" w:type="dxa"/>
+              <w:left w:w="195" w:type="dxa"/>
+              <w:bottom w:w="90" w:type="dxa"/>
+              <w:right w:w="195" w:type="dxa"/>
+            </w:tcMar>
+            <w:vAlign w:val="center"/>
+            <w:hideMark/>
+          </w:tcPr>
+          <w:p>
+            <w:r>
+              <w:rPr>
+                <w:b/>
+                <w:bCs/>
+              </w:rPr>
+              <w:t>Movement</w:t>
+            </w:r>
+          </w:p>
+        </w:tc>
+        <w:tc>
+          <w:tcPr>
+            <w:tcW w:w="0" w:type="auto"/>
+            <w:tcBorders>
+              <w:top w:val="single" w:sz="4" w:space="0" w:color="3D444D"/>
+              <w:left w:val="single" w:sz="4" w:space="0" w:color="3D444D"/>
+              <w:bottom w:val="single" w:sz="4" w:space="0" w:color="3D444D"/>
+              <w:right w:val="single" w:sz="4" w:space="0" w:color="3D444D"/>
+            </w:tcBorders>
+            <w:shd w:val="clear" w:color="auto" w:fill="151B23"/>
+            <w:tcMar>
+              <w:top w:w="90" w:type="dxa"/>
+              <w:left w:w="195" w:type="dxa"/>
+              <w:bottom w:w="90" w:type="dxa"/>
+              <w:right w:w="195" w:type="dxa"/>
+            </w:tcMar>
+            <w:vAlign w:val="center"/>
+            <w:hideMark/>
+          </w:tcPr>
+          <w:p>
+            <w:r>
+              <w:t>Smooth joystick with configurable hold delay/repeat, soft fade transitions between pixels</w:t>
+            </w:r>
+          </w:p>
+        </w:tc>
+      </w:tr>
+      <w:tr>
+        <w:tc>
+          <w:tcPr>
+            <w:tcW w:w="0" w:type="auto"/>
+            <w:tcBorders>
+              <w:top w:val="single" w:sz="4" w:space="0" w:color="3D444D"/>
+              <w:left w:val="single" w:sz="4" w:space="0" w:color="3D444D"/>
+              <w:bottom w:val="single" w:sz="4" w:space="0" w:color="3D444D"/>
+              <w:right w:val="single" w:sz="4" w:space="0" w:color="3D444D"/>
+            </w:tcBorders>
+            <w:shd w:val="clear" w:color="auto" w:fill="0D1117"/>
+            <w:tcMar>
+              <w:top w:w="90" w:type="dxa"/>
+              <w:left w:w="195" w:type="dxa"/>
+              <w:bottom w:w="90" w:type="dxa"/>
+              <w:right w:w="195" w:type="dxa"/>
+            </w:tcMar>
+            <w:vAlign w:val="center"/>
+            <w:hideMark/>
+          </w:tcPr>
+          <w:p>
+            <w:r>
+              <w:rPr>
+                <w:b/>
+                <w:bCs/>
+              </w:rPr>
+              <w:t>Lane Switch</w:t>
+            </w:r>
+          </w:p>
+        </w:tc>
+        <w:tc>
+          <w:tcPr>
+            <w:tcW w:w="0" w:type="auto"/>
+            <w:tcBorders>
+              <w:top w:val="single" w:sz="4" w:space="0" w:color="3D444D"/>
+              <w:left w:val="single" w:sz="4" w:space="0" w:color="3D444D"/>
+              <w:bottom w:val="single" w:sz="4" w:space="0" w:color="3D444D"/>
+              <w:right w:val="single" w:sz="4" w:space="0" w:color="3D444D"/>
+            </w:tcBorders>
+            <w:shd w:val="clear" w:color="auto" w:fill="0D1117"/>
+            <w:tcMar>
+              <w:top w:w="90" w:type="dxa"/>
+              <w:left w:w="195" w:type="dxa"/>
+              <w:bottom w:w="90" w:type="dxa"/>
+              <w:right w:w="195" w:type="dxa"/>
+            </w:tcMar>
+            <w:vAlign w:val="center"/>
+            <w:hideMark/>
+          </w:tcPr>
+          <w:p>
+            <w:r>
+              <w:t>Maintains vertical position, crossfade transition, resets vertical direction (blocks shots until moved)</w:t>
+            </w:r>
+          </w:p>
+        </w:tc>
+      </w:tr>
+      <w:tr>
+        <w:tc>
+          <w:tcPr>
+            <w:tcW w:w="0" w:type="auto"/>
+            <w:tcBorders>
+              <w:top w:val="single" w:sz="4" w:space="0" w:color="3D444D"/>
+              <w:left w:val="single" w:sz="4" w:space="0" w:color="3D444D"/>
+              <w:bottom w:val="single" w:sz="4" w:space="0" w:color="3D444D"/>
+              <w:right w:val="single" w:sz="4" w:space="0" w:color="3D444D"/>
+            </w:tcBorders>
+            <w:shd w:val="clear" w:color="auto" w:fill="151B23"/>
+            <w:tcMar>
+              <w:top w:w="90" w:type="dxa"/>
+              <w:left w:w="195" w:type="dxa"/>
+              <w:bottom w:w="90" w:type="dxa"/>
+              <w:right w:w="195" w:type="dxa"/>
+            </w:tcMar>
+            <w:vAlign w:val="center"/>
+            <w:hideMark/>
+          </w:tcPr>
+          <w:p>
+            <w:r>
+              <w:rPr>
+                <w:b/>
+                <w:bCs/>
+              </w:rPr>
+              <w:t>Shooting</w:t>
+            </w:r>
+          </w:p>
+        </w:tc>
+        <w:tc>
+          <w:tcPr>
+            <w:tcW w:w="0" w:type="auto"/>
+            <w:tcBorders>
+              <w:top w:val="single" w:sz="4" w:space="0" w:color="3D444D"/>
+              <w:left w:val="single" w:sz="4" w:space="0" w:color="3D444D"/>
+              <w:bottom w:val="single" w:sz="4" w:space="0" w:color="3D444D"/>
+              <w:right w:val="single" w:sz="4" w:space="0" w:color="3D444D"/>
+            </w:tcBorders>
+            <w:shd w:val="clear" w:color="auto" w:fill="151B23"/>
+            <w:tcMar>
+              <w:top w:w="90" w:type="dxa"/>
+              <w:left w:w="195" w:type="dxa"/>
+              <w:bottom w:w="90" w:type="dxa"/>
+              <w:right w:w="195" w:type="dxa"/>
+            </w:tcMar>
+            <w:vAlign w:val="center"/>
+            <w:hideMark/>
+          </w:tcPr>
+          <w:p>
+            <w:r>
+              <w:t xml:space="preserve">Fires in last vertical direction; if both opposing snakes share lead color AND correct button pressed → fires BOTH directions; </w:t>
+            </w:r>
+            <w:proofErr w:type="gramStart"/>
+            <w:r>
+              <w:t>otherwise</w:t>
+            </w:r>
+            <w:proofErr w:type="gramEnd"/>
+            <w:r>
+              <w:t xml:space="preserve"> single direction</w:t>
+            </w:r>
+          </w:p>
+        </w:tc>
+      </w:tr>
+      <w:tr>
+        <w:tc>
+          <w:tcPr>
+            <w:tcW w:w="0" w:type="auto"/>
+            <w:tcBorders>
+              <w:top w:val="single" w:sz="4" w:space="0" w:color="3D444D"/>
+              <w:left w:val="single" w:sz="4" w:space="0" w:color="3D444D"/>
+              <w:bottom w:val="single" w:sz="4" w:space="0" w:color="3D444D"/>
+              <w:right w:val="single" w:sz="4" w:space="0" w:color="3D444D"/>
+            </w:tcBorders>
+            <w:shd w:val="clear" w:color="auto" w:fill="0D1117"/>
+            <w:tcMar>
+              <w:top w:w="90" w:type="dxa"/>
+              <w:left w:w="195" w:type="dxa"/>
+              <w:bottom w:w="90" w:type="dxa"/>
+              <w:right w:w="195" w:type="dxa"/>
+            </w:tcMar>
+            <w:vAlign w:val="center"/>
+            <w:hideMark/>
+          </w:tcPr>
+          <w:p>
+            <w:r>
+              <w:rPr>
+                <w:b/>
+                <w:bCs/>
+              </w:rPr>
+              <w:t>Blocked Shot</w:t>
+            </w:r>
+          </w:p>
+        </w:tc>
+        <w:tc>
+          <w:tcPr>
+            <w:tcW w:w="0" w:type="auto"/>
+            <w:tcBorders>
+              <w:top w:val="single" w:sz="4" w:space="0" w:color="3D444D"/>
+              <w:left w:val="single" w:sz="4" w:space="0" w:color="3D444D"/>
+              <w:bottom w:val="single" w:sz="4" w:space="0" w:color="3D444D"/>
+              <w:right w:val="single" w:sz="4" w:space="0" w:color="3D444D"/>
+            </w:tcBorders>
+            <w:shd w:val="clear" w:color="auto" w:fill="0D1117"/>
+            <w:tcMar>
+              <w:top w:w="90" w:type="dxa"/>
+              <w:left w:w="195" w:type="dxa"/>
+              <w:bottom w:w="90" w:type="dxa"/>
+              <w:right w:w="195" w:type="dxa"/>
+            </w:tcMar>
+            <w:vAlign w:val="center"/>
+            <w:hideMark/>
+          </w:tcPr>
+          <w:p>
+            <w:r>
+              <w:t>No vertical direction established = shot blocked with distinct sound</w:t>
+            </w:r>
+          </w:p>
+        </w:tc>
+      </w:tr>
+      <w:tr>
+        <w:tc>
+          <w:tcPr>
+            <w:tcW w:w="0" w:type="auto"/>
+            <w:tcBorders>
+              <w:top w:val="single" w:sz="4" w:space="0" w:color="3D444D"/>
+              <w:left w:val="single" w:sz="4" w:space="0" w:color="3D444D"/>
+              <w:bottom w:val="single" w:sz="4" w:space="0" w:color="3D444D"/>
+              <w:right w:val="single" w:sz="4" w:space="0" w:color="3D444D"/>
+            </w:tcBorders>
+            <w:shd w:val="clear" w:color="auto" w:fill="151B23"/>
+            <w:tcMar>
+              <w:top w:w="90" w:type="dxa"/>
+              <w:left w:w="195" w:type="dxa"/>
+              <w:bottom w:w="90" w:type="dxa"/>
+              <w:right w:w="195" w:type="dxa"/>
+            </w:tcMar>
+            <w:vAlign w:val="center"/>
+            <w:hideMark/>
+          </w:tcPr>
+          <w:p>
+            <w:r>
+              <w:rPr>
+                <w:b/>
+                <w:bCs/>
+              </w:rPr>
+              <w:t>Projectile</w:t>
+            </w:r>
+          </w:p>
+        </w:tc>
+        <w:tc>
+          <w:tcPr>
+            <w:tcW w:w="0" w:type="auto"/>
+            <w:tcBorders>
+              <w:top w:val="single" w:sz="4" w:space="0" w:color="3D444D"/>
+              <w:left w:val="single" w:sz="4" w:space="0" w:color="3D444D"/>
+              <w:bottom w:val="single" w:sz="4" w:space="0" w:color="3D444D"/>
+              <w:right w:val="single" w:sz="4" w:space="0" w:color="3D444D"/>
+            </w:tcBorders>
+            <w:shd w:val="clear" w:color="auto" w:fill="151B23"/>
+            <w:tcMar>
+              <w:top w:w="90" w:type="dxa"/>
+              <w:left w:w="195" w:type="dxa"/>
+              <w:bottom w:w="90" w:type="dxa"/>
+              <w:right w:w="195" w:type="dxa"/>
+            </w:tcMar>
+            <w:vAlign w:val="center"/>
+            <w:hideMark/>
+          </w:tcPr>
+          <w:p>
+            <w:r>
+              <w:t>Default red, single pixel, configurable speed and color</w:t>
+            </w:r>
+          </w:p>
+        </w:tc>
+      </w:tr>
+    </w:tbl>
+    <w:p>
+      <w:pPr>
+        <w:rPr>
+          <w:b/>
+          <w:bCs/>
+        </w:rPr>
+      </w:pPr>
+      <w:r>
+        <w:rPr>
+          <w:b/>
+          <w:bCs/>
+        </w:rPr>
+        <w:t>Snake System</w:t>
+      </w:r>
+    </w:p>
+    <w:tbl>
+      <w:tblPr>
+        <w:tblW w:w="0" w:type="auto"/>
+        <w:shd w:val="clear" w:color="auto" w:fill="0D1117"/>
+        <w:tblCellMar>
+          <w:top w:w="15" w:type="dxa"/>
+          <w:left w:w="15" w:type="dxa"/>
+          <w:bottom w:w="15" w:type="dxa"/>
+          <w:right w:w="15" w:type="dxa"/>
+        </w:tblCellMar>
+        <w:tblLook w:val="04A0" w:firstRow="1" w:lastRow="0" w:firstColumn="1" w:lastColumn="0" w:noHBand="0" w:noVBand="1"/>
+      </w:tblPr>
+      <w:tblGrid>
+        <w:gridCol w:w="1726"/>
+        <w:gridCol w:w="8456"/>
+      </w:tblGrid>
+      <w:tr>
+        <w:trPr>
+          <w:tblHeader/>
+        </w:trPr>
+        <w:tc>
+          <w:tcPr>
+            <w:tcW w:w="0" w:type="auto"/>
+            <w:tcBorders>
+              <w:top w:val="single" w:sz="4" w:space="0" w:color="3D444D"/>
+              <w:left w:val="single" w:sz="4" w:space="0" w:color="3D444D"/>
+              <w:bottom w:val="single" w:sz="4" w:space="0" w:color="3D444D"/>
+              <w:right w:val="single" w:sz="4" w:space="0" w:color="3D444D"/>
+            </w:tcBorders>
+            <w:shd w:val="clear" w:color="auto" w:fill="0D1117"/>
+            <w:tcMar>
+              <w:top w:w="90" w:type="dxa"/>
+              <w:left w:w="195" w:type="dxa"/>
+              <w:bottom w:w="90" w:type="dxa"/>
+              <w:right w:w="195" w:type="dxa"/>
+            </w:tcMar>
+            <w:vAlign w:val="center"/>
+            <w:hideMark/>
+          </w:tcPr>
+          <w:p>
+            <w:pPr>
+              <w:rPr>
+                <w:b/>
+                <w:bCs/>
+              </w:rPr>
+            </w:pPr>
+            <w:r>
+              <w:rPr>
+                <w:b/>
+                <w:bCs/>
+              </w:rPr>
+              <w:t>Type</w:t>
+            </w:r>
+          </w:p>
+        </w:tc>
+        <w:tc>
+          <w:tcPr>
+            <w:tcW w:w="0" w:type="auto"/>
+            <w:tcBorders>
+              <w:top w:val="single" w:sz="4" w:space="0" w:color="3D444D"/>
+              <w:left w:val="single" w:sz="4" w:space="0" w:color="3D444D"/>
+              <w:bottom w:val="single" w:sz="4" w:space="0" w:color="3D444D"/>
+              <w:right w:val="single" w:sz="4" w:space="0" w:color="3D444D"/>
+            </w:tcBorders>
+            <w:shd w:val="clear" w:color="auto" w:fill="0D1117"/>
+            <w:tcMar>
+              <w:top w:w="90" w:type="dxa"/>
+              <w:left w:w="195" w:type="dxa"/>
+              <w:bottom w:w="90" w:type="dxa"/>
+              <w:right w:w="195" w:type="dxa"/>
+            </w:tcMar>
+            <w:vAlign w:val="center"/>
+            <w:hideMark/>
+          </w:tcPr>
+          <w:p>
+            <w:pPr>
+              <w:rPr>
+                <w:b/>
+                <w:bCs/>
+              </w:rPr>
+            </w:pPr>
+            <w:r>
+              <w:rPr>
+                <w:b/>
+                <w:bCs/>
+              </w:rPr>
+              <w:t>Behavior</w:t>
+            </w:r>
+          </w:p>
+        </w:tc>
+      </w:tr>
+      <w:tr>
+        <w:tc>
+          <w:tcPr>
+            <w:tcW w:w="0" w:type="auto"/>
+            <w:tcBorders>
+              <w:top w:val="single" w:sz="4" w:space="0" w:color="3D444D"/>
+              <w:left w:val="single" w:sz="4" w:space="0" w:color="3D444D"/>
+              <w:bottom w:val="single" w:sz="4" w:space="0" w:color="3D444D"/>
+              <w:right w:val="single" w:sz="4" w:space="0" w:color="3D444D"/>
+            </w:tcBorders>
+            <w:shd w:val="clear" w:color="auto" w:fill="0D1117"/>
+            <w:tcMar>
+              <w:top w:w="90" w:type="dxa"/>
+              <w:left w:w="195" w:type="dxa"/>
+              <w:bottom w:w="90" w:type="dxa"/>
+              <w:right w:w="195" w:type="dxa"/>
+            </w:tcMar>
+            <w:vAlign w:val="center"/>
+            <w:hideMark/>
+          </w:tcPr>
+          <w:p>
+            <w:r>
+              <w:rPr>
+                <w:b/>
+                <w:bCs/>
+              </w:rPr>
+              <w:t>Normal Snake</w:t>
+            </w:r>
+          </w:p>
+        </w:tc>
+        <w:tc>
+          <w:tcPr>
+            <w:tcW w:w="0" w:type="auto"/>
+            <w:tcBorders>
+              <w:top w:val="single" w:sz="4" w:space="0" w:color="3D444D"/>
+              <w:left w:val="single" w:sz="4" w:space="0" w:color="3D444D"/>
+              <w:bottom w:val="single" w:sz="4" w:space="0" w:color="3D444D"/>
+              <w:right w:val="single" w:sz="4" w:space="0" w:color="3D444D"/>
+            </w:tcBorders>
+            <w:shd w:val="clear" w:color="auto" w:fill="0D1117"/>
+            <w:tcMar>
+              <w:top w:w="90" w:type="dxa"/>
+              <w:left w:w="195" w:type="dxa"/>
+              <w:bottom w:w="90" w:type="dxa"/>
+              <w:right w:w="195" w:type="dxa"/>
+            </w:tcMar>
+            <w:vAlign w:val="center"/>
+            <w:hideMark/>
+          </w:tcPr>
+          <w:p>
+            <w:r>
+              <w:t>Spawns top/bottom, travels toward opposite end, pass-through on overlap, tail overlap creates egg</w:t>
+            </w:r>
+          </w:p>
+        </w:tc>
+      </w:tr>
+      <w:tr>
+        <w:tc>
+          <w:tcPr>
+            <w:tcW w:w="0" w:type="auto"/>
+            <w:tcBorders>
+              <w:top w:val="single" w:sz="4" w:space="0" w:color="3D444D"/>
+              <w:left w:val="single" w:sz="4" w:space="0" w:color="3D444D"/>
+              <w:bottom w:val="single" w:sz="4" w:space="0" w:color="3D444D"/>
+              <w:right w:val="single" w:sz="4" w:space="0" w:color="3D444D"/>
+            </w:tcBorders>
+            <w:shd w:val="clear" w:color="auto" w:fill="151B23"/>
+            <w:tcMar>
+              <w:top w:w="90" w:type="dxa"/>
+              <w:left w:w="195" w:type="dxa"/>
+              <w:bottom w:w="90" w:type="dxa"/>
+              <w:right w:w="195" w:type="dxa"/>
+            </w:tcMar>
+            <w:vAlign w:val="center"/>
+            <w:hideMark/>
+          </w:tcPr>
+          <w:p>
+            <w:r>
+              <w:rPr>
+                <w:b/>
+                <w:bCs/>
+              </w:rPr>
+              <w:t>Baby Snake</w:t>
+            </w:r>
+          </w:p>
+        </w:tc>
+        <w:tc>
+          <w:tcPr>
+            <w:tcW w:w="0" w:type="auto"/>
+            <w:tcBorders>
+              <w:top w:val="single" w:sz="4" w:space="0" w:color="3D444D"/>
+              <w:left w:val="single" w:sz="4" w:space="0" w:color="3D444D"/>
+              <w:bottom w:val="single" w:sz="4" w:space="0" w:color="3D444D"/>
+              <w:right w:val="single" w:sz="4" w:space="0" w:color="3D444D"/>
+            </w:tcBorders>
+            <w:shd w:val="clear" w:color="auto" w:fill="151B23"/>
+            <w:tcMar>
+              <w:top w:w="90" w:type="dxa"/>
+              <w:left w:w="195" w:type="dxa"/>
+              <w:bottom w:w="90" w:type="dxa"/>
+              <w:right w:w="195" w:type="dxa"/>
+            </w:tcMar>
+            <w:vAlign w:val="center"/>
+            <w:hideMark/>
+          </w:tcPr>
+          <w:p>
+            <w:r>
+              <w:t>3 pixels, random color, spawns from hatch (2 up, 2 down), single hit to destroy, exits field permanently</w:t>
+            </w:r>
+          </w:p>
+        </w:tc>
+      </w:tr>
+      <w:tr>
+        <w:tc>
+          <w:tcPr>
+            <w:tcW w:w="0" w:type="auto"/>
+            <w:tcBorders>
+              <w:top w:val="single" w:sz="4" w:space="0" w:color="3D444D"/>
+              <w:left w:val="single" w:sz="4" w:space="0" w:color="3D444D"/>
+              <w:bottom w:val="single" w:sz="4" w:space="0" w:color="3D444D"/>
+              <w:right w:val="single" w:sz="4" w:space="0" w:color="3D444D"/>
+            </w:tcBorders>
+            <w:shd w:val="clear" w:color="auto" w:fill="0D1117"/>
+            <w:tcMar>
+              <w:top w:w="90" w:type="dxa"/>
+              <w:left w:w="195" w:type="dxa"/>
+              <w:bottom w:w="90" w:type="dxa"/>
+              <w:right w:w="195" w:type="dxa"/>
+            </w:tcMar>
+            <w:vAlign w:val="center"/>
+            <w:hideMark/>
+          </w:tcPr>
+          <w:p>
+            <w:r>
+              <w:rPr>
+                <w:b/>
+                <w:bCs/>
+              </w:rPr>
+              <w:t>Hunter Snake (Mode 2)</w:t>
+            </w:r>
+          </w:p>
+        </w:tc>
+        <w:tc>
+          <w:tcPr>
+            <w:tcW w:w="0" w:type="auto"/>
+            <w:tcBorders>
+              <w:top w:val="single" w:sz="4" w:space="0" w:color="3D444D"/>
+              <w:left w:val="single" w:sz="4" w:space="0" w:color="3D444D"/>
+              <w:bottom w:val="single" w:sz="4" w:space="0" w:color="3D444D"/>
+              <w:right w:val="single" w:sz="4" w:space="0" w:color="3D444D"/>
+            </w:tcBorders>
+            <w:shd w:val="clear" w:color="auto" w:fill="0D1117"/>
+            <w:tcMar>
+              <w:top w:w="90" w:type="dxa"/>
+              <w:left w:w="195" w:type="dxa"/>
+              <w:bottom w:w="90" w:type="dxa"/>
+              <w:right w:w="195" w:type="dxa"/>
+            </w:tcMar>
+            <w:vAlign w:val="center"/>
+            <w:hideMark/>
+          </w:tcPr>
+          <w:p>
+            <w:r>
+              <w:t>Transforms when normal snake overlaps egg, egg consumed, other snakes retreat permanently, fires orange projectile every 100ms, U-turns at lane end, separate front/rear damage counters</w:t>
+            </w:r>
+          </w:p>
+        </w:tc>
+      </w:tr>
+    </w:tbl>
+    <w:p>
+      <w:pPr>
+        <w:rPr>
+          <w:b/>
+          <w:bCs/>
+        </w:rPr>
+      </w:pPr>
+      <w:r>
+        <w:rPr>
+          <w:b/>
+          <w:bCs/>
+        </w:rPr>
+        <w:t>Egg System</w:t>
+      </w:r>
+    </w:p>
+    <w:tbl>
+      <w:tblPr>
+        <w:tblW w:w="0" w:type="auto"/>
+        <w:shd w:val="clear" w:color="auto" w:fill="0D1117"/>
+        <w:tblCellMar>
+          <w:top w:w="15" w:type="dxa"/>
+          <w:left w:w="15" w:type="dxa"/>
+          <w:bottom w:w="15" w:type="dxa"/>
+          <w:right w:w="15" w:type="dxa"/>
+        </w:tblCellMar>
+        <w:tblLook w:val="04A0" w:firstRow="1" w:lastRow="0" w:firstColumn="1" w:lastColumn="0" w:noHBand="0" w:noVBand="1"/>
+      </w:tblPr>
+      <w:tblGrid>
+        <w:gridCol w:w="2018"/>
+        <w:gridCol w:w="8164"/>
+      </w:tblGrid>
+      <w:tr>
+        <w:trPr>
+          <w:tblHeader/>
+        </w:trPr>
+        <w:tc>
+          <w:tcPr>
+            <w:tcW w:w="0" w:type="auto"/>
+            <w:tcBorders>
+              <w:top w:val="single" w:sz="4" w:space="0" w:color="3D444D"/>
+              <w:left w:val="single" w:sz="4" w:space="0" w:color="3D444D"/>
+              <w:bottom w:val="single" w:sz="4" w:space="0" w:color="3D444D"/>
+              <w:right w:val="single" w:sz="4" w:space="0" w:color="3D444D"/>
+            </w:tcBorders>
+            <w:shd w:val="clear" w:color="auto" w:fill="0D1117"/>
+            <w:tcMar>
+              <w:top w:w="90" w:type="dxa"/>
+              <w:left w:w="195" w:type="dxa"/>
+              <w:bottom w:w="90" w:type="dxa"/>
+              <w:right w:w="195" w:type="dxa"/>
+            </w:tcMar>
+            <w:vAlign w:val="center"/>
+            <w:hideMark/>
+          </w:tcPr>
+          <w:p>
+            <w:pPr>
+              <w:rPr>
+                <w:b/>
+                <w:bCs/>
+              </w:rPr>
+            </w:pPr>
+            <w:r>
+              <w:rPr>
+                <w:b/>
+                <w:bCs/>
+              </w:rPr>
+              <w:t>Event</w:t>
+            </w:r>
+          </w:p>
+        </w:tc>
+        <w:tc>
+          <w:tcPr>
+            <w:tcW w:w="0" w:type="auto"/>
+            <w:tcBorders>
+              <w:top w:val="single" w:sz="4" w:space="0" w:color="3D444D"/>
+              <w:left w:val="single" w:sz="4" w:space="0" w:color="3D444D"/>
+              <w:bottom w:val="single" w:sz="4" w:space="0" w:color="3D444D"/>
+              <w:right w:val="single" w:sz="4" w:space="0" w:color="3D444D"/>
+            </w:tcBorders>
+            <w:shd w:val="clear" w:color="auto" w:fill="0D1117"/>
+            <w:tcMar>
+              <w:top w:w="90" w:type="dxa"/>
+              <w:left w:w="195" w:type="dxa"/>
+              <w:bottom w:w="90" w:type="dxa"/>
+              <w:right w:w="195" w:type="dxa"/>
+            </w:tcMar>
+            <w:vAlign w:val="center"/>
+            <w:hideMark/>
+          </w:tcPr>
+          <w:p>
+            <w:pPr>
+              <w:rPr>
+                <w:b/>
+                <w:bCs/>
+              </w:rPr>
+            </w:pPr>
+            <w:r>
+              <w:rPr>
+                <w:b/>
+                <w:bCs/>
+              </w:rPr>
+              <w:t>Behavior</w:t>
+            </w:r>
+          </w:p>
+        </w:tc>
+      </w:tr>
+      <w:tr>
+        <w:tc>
+          <w:tcPr>
+            <w:tcW w:w="0" w:type="auto"/>
+            <w:tcBorders>
+              <w:top w:val="single" w:sz="4" w:space="0" w:color="3D444D"/>
+              <w:left w:val="single" w:sz="4" w:space="0" w:color="3D444D"/>
+              <w:bottom w:val="single" w:sz="4" w:space="0" w:color="3D444D"/>
+              <w:right w:val="single" w:sz="4" w:space="0" w:color="3D444D"/>
+            </w:tcBorders>
+            <w:shd w:val="clear" w:color="auto" w:fill="0D1117"/>
+            <w:tcMar>
+              <w:top w:w="90" w:type="dxa"/>
+              <w:left w:w="195" w:type="dxa"/>
+              <w:bottom w:w="90" w:type="dxa"/>
+              <w:right w:w="195" w:type="dxa"/>
+            </w:tcMar>
+            <w:vAlign w:val="center"/>
+            <w:hideMark/>
+          </w:tcPr>
+          <w:p>
+            <w:r>
+              <w:rPr>
+                <w:b/>
+                <w:bCs/>
+              </w:rPr>
+              <w:t>Egg Spawn</w:t>
+            </w:r>
+          </w:p>
+        </w:tc>
+        <w:tc>
+          <w:tcPr>
+            <w:tcW w:w="0" w:type="auto"/>
+            <w:tcBorders>
+              <w:top w:val="single" w:sz="4" w:space="0" w:color="3D444D"/>
+              <w:left w:val="single" w:sz="4" w:space="0" w:color="3D444D"/>
+              <w:bottom w:val="single" w:sz="4" w:space="0" w:color="3D444D"/>
+              <w:right w:val="single" w:sz="4" w:space="0" w:color="3D444D"/>
+            </w:tcBorders>
+            <w:shd w:val="clear" w:color="auto" w:fill="0D1117"/>
+            <w:tcMar>
+              <w:top w:w="90" w:type="dxa"/>
+              <w:left w:w="195" w:type="dxa"/>
+              <w:bottom w:w="90" w:type="dxa"/>
+              <w:right w:w="195" w:type="dxa"/>
+            </w:tcMar>
+            <w:vAlign w:val="center"/>
+            <w:hideMark/>
+          </w:tcPr>
+          <w:p>
+            <w:r>
+              <w:t>Golden, appears when two snake tails overlap, 1 per lane max</w:t>
+            </w:r>
+          </w:p>
+        </w:tc>
+      </w:tr>
+      <w:tr>
+        <w:tc>
+          <w:tcPr>
+            <w:tcW w:w="0" w:type="auto"/>
+            <w:tcBorders>
+              <w:top w:val="single" w:sz="4" w:space="0" w:color="3D444D"/>
+              <w:left w:val="single" w:sz="4" w:space="0" w:color="3D444D"/>
+              <w:bottom w:val="single" w:sz="4" w:space="0" w:color="3D444D"/>
+              <w:right w:val="single" w:sz="4" w:space="0" w:color="3D444D"/>
+            </w:tcBorders>
+            <w:shd w:val="clear" w:color="auto" w:fill="151B23"/>
+            <w:tcMar>
+              <w:top w:w="90" w:type="dxa"/>
+              <w:left w:w="195" w:type="dxa"/>
+              <w:bottom w:w="90" w:type="dxa"/>
+              <w:right w:w="195" w:type="dxa"/>
+            </w:tcMar>
+            <w:vAlign w:val="center"/>
+            <w:hideMark/>
+          </w:tcPr>
+          <w:p>
+            <w:r>
+              <w:rPr>
+                <w:b/>
+                <w:bCs/>
+              </w:rPr>
+              <w:t>Egg Visual</w:t>
+            </w:r>
+          </w:p>
+        </w:tc>
+        <w:tc>
+          <w:tcPr>
+            <w:tcW w:w="0" w:type="auto"/>
+            <w:tcBorders>
+              <w:top w:val="single" w:sz="4" w:space="0" w:color="3D444D"/>
+              <w:left w:val="single" w:sz="4" w:space="0" w:color="3D444D"/>
+              <w:bottom w:val="single" w:sz="4" w:space="0" w:color="3D444D"/>
+              <w:right w:val="single" w:sz="4" w:space="0" w:color="3D444D"/>
+            </w:tcBorders>
+            <w:shd w:val="clear" w:color="auto" w:fill="151B23"/>
+            <w:tcMar>
+              <w:top w:w="90" w:type="dxa"/>
+              <w:left w:w="195" w:type="dxa"/>
+              <w:bottom w:w="90" w:type="dxa"/>
+              <w:right w:w="195" w:type="dxa"/>
+            </w:tcMar>
+            <w:vAlign w:val="center"/>
+            <w:hideMark/>
+          </w:tcPr>
+          <w:p>
+            <w:r>
+              <w:t>Pulses, optional color wash through snake colors</w:t>
+            </w:r>
+          </w:p>
+        </w:tc>
+      </w:tr>
+      <w:tr>
+        <w:tc>
+          <w:tcPr>
+            <w:tcW w:w="0" w:type="auto"/>
+            <w:tcBorders>
+              <w:top w:val="single" w:sz="4" w:space="0" w:color="3D444D"/>
+              <w:left w:val="single" w:sz="4" w:space="0" w:color="3D444D"/>
+              <w:bottom w:val="single" w:sz="4" w:space="0" w:color="3D444D"/>
+              <w:right w:val="single" w:sz="4" w:space="0" w:color="3D444D"/>
+            </w:tcBorders>
+            <w:shd w:val="clear" w:color="auto" w:fill="0D1117"/>
+            <w:tcMar>
+              <w:top w:w="90" w:type="dxa"/>
+              <w:left w:w="195" w:type="dxa"/>
+              <w:bottom w:w="90" w:type="dxa"/>
+              <w:right w:w="195" w:type="dxa"/>
+            </w:tcMar>
+            <w:vAlign w:val="center"/>
+            <w:hideMark/>
+          </w:tcPr>
+          <w:p>
+            <w:r>
+              <w:rPr>
+                <w:b/>
+                <w:bCs/>
+              </w:rPr>
+              <w:t>Egg Collection</w:t>
+            </w:r>
+          </w:p>
+        </w:tc>
+        <w:tc>
+          <w:tcPr>
+            <w:tcW w:w="0" w:type="auto"/>
+            <w:tcBorders>
+              <w:top w:val="single" w:sz="4" w:space="0" w:color="3D444D"/>
+              <w:left w:val="single" w:sz="4" w:space="0" w:color="3D444D"/>
+              <w:bottom w:val="single" w:sz="4" w:space="0" w:color="3D444D"/>
+              <w:right w:val="single" w:sz="4" w:space="0" w:color="3D444D"/>
+            </w:tcBorders>
+            <w:shd w:val="clear" w:color="auto" w:fill="0D1117"/>
+            <w:tcMar>
+              <w:top w:w="90" w:type="dxa"/>
+              <w:left w:w="195" w:type="dxa"/>
+              <w:bottom w:w="90" w:type="dxa"/>
+              <w:right w:w="195" w:type="dxa"/>
+            </w:tcMar>
+            <w:vAlign w:val="center"/>
+            <w:hideMark/>
+          </w:tcPr>
+          <w:p>
+            <w:r>
+              <w:t>Player touches egg to destroy it (risky but rewarding)</w:t>
+            </w:r>
+          </w:p>
+        </w:tc>
+      </w:tr>
+      <w:tr>
+        <w:tc>
+          <w:tcPr>
+            <w:tcW w:w="0" w:type="auto"/>
+            <w:tcBorders>
+              <w:top w:val="single" w:sz="4" w:space="0" w:color="3D444D"/>
+              <w:left w:val="single" w:sz="4" w:space="0" w:color="3D444D"/>
+              <w:bottom w:val="single" w:sz="4" w:space="0" w:color="3D444D"/>
+              <w:right w:val="single" w:sz="4" w:space="0" w:color="3D444D"/>
+            </w:tcBorders>
+            <w:shd w:val="clear" w:color="auto" w:fill="151B23"/>
+            <w:tcMar>
+              <w:top w:w="90" w:type="dxa"/>
+              <w:left w:w="195" w:type="dxa"/>
+              <w:bottom w:w="90" w:type="dxa"/>
+              <w:right w:w="195" w:type="dxa"/>
+            </w:tcMar>
+            <w:vAlign w:val="center"/>
+            <w:hideMark/>
+          </w:tcPr>
+          <w:p>
+            <w:r>
+              <w:rPr>
+                <w:b/>
+                <w:bCs/>
+              </w:rPr>
+              <w:t>Egg Hatch</w:t>
+            </w:r>
+          </w:p>
+        </w:tc>
+        <w:tc>
+          <w:tcPr>
+            <w:tcW w:w="0" w:type="auto"/>
+            <w:tcBorders>
+              <w:top w:val="single" w:sz="4" w:space="0" w:color="3D444D"/>
+              <w:left w:val="single" w:sz="4" w:space="0" w:color="3D444D"/>
+              <w:bottom w:val="single" w:sz="4" w:space="0" w:color="3D444D"/>
+              <w:right w:val="single" w:sz="4" w:space="0" w:color="3D444D"/>
+            </w:tcBorders>
+            <w:shd w:val="clear" w:color="auto" w:fill="151B23"/>
+            <w:tcMar>
+              <w:top w:w="90" w:type="dxa"/>
+              <w:left w:w="195" w:type="dxa"/>
+              <w:bottom w:w="90" w:type="dxa"/>
+              <w:right w:w="195" w:type="dxa"/>
+            </w:tcMar>
+            <w:vAlign w:val="center"/>
+            <w:hideMark/>
+          </w:tcPr>
+          <w:p>
+            <w:r>
+              <w:t>10 sec default, spawns 4 baby snakes, shell dims over 3 sec then disappears</w:t>
+            </w:r>
+          </w:p>
+        </w:tc>
+      </w:tr>
+      <w:tr>
+        <w:tc>
+          <w:tcPr>
+            <w:tcW w:w="0" w:type="auto"/>
+            <w:tcBorders>
+              <w:top w:val="single" w:sz="4" w:space="0" w:color="3D444D"/>
+              <w:left w:val="single" w:sz="4" w:space="0" w:color="3D444D"/>
+              <w:bottom w:val="single" w:sz="4" w:space="0" w:color="3D444D"/>
+              <w:right w:val="single" w:sz="4" w:space="0" w:color="3D444D"/>
+            </w:tcBorders>
+            <w:shd w:val="clear" w:color="auto" w:fill="0D1117"/>
+            <w:tcMar>
+              <w:top w:w="90" w:type="dxa"/>
+              <w:left w:w="195" w:type="dxa"/>
+              <w:bottom w:w="90" w:type="dxa"/>
+              <w:right w:w="195" w:type="dxa"/>
+            </w:tcMar>
+            <w:vAlign w:val="center"/>
+            <w:hideMark/>
+          </w:tcPr>
+          <w:p>
+            <w:r>
+              <w:rPr>
+                <w:b/>
+                <w:bCs/>
+              </w:rPr>
+              <w:t>Hunter Transform</w:t>
+            </w:r>
+          </w:p>
+        </w:tc>
+        <w:tc>
+          <w:tcPr>
+            <w:tcW w:w="0" w:type="auto"/>
+            <w:tcBorders>
+              <w:top w:val="single" w:sz="4" w:space="0" w:color="3D444D"/>
+              <w:left w:val="single" w:sz="4" w:space="0" w:color="3D444D"/>
+              <w:bottom w:val="single" w:sz="4" w:space="0" w:color="3D444D"/>
+              <w:right w:val="single" w:sz="4" w:space="0" w:color="3D444D"/>
+            </w:tcBorders>
+            <w:shd w:val="clear" w:color="auto" w:fill="0D1117"/>
+            <w:tcMar>
+              <w:top w:w="90" w:type="dxa"/>
+              <w:left w:w="195" w:type="dxa"/>
+              <w:bottom w:w="90" w:type="dxa"/>
+              <w:right w:w="195" w:type="dxa"/>
+            </w:tcMar>
+            <w:vAlign w:val="center"/>
+            <w:hideMark/>
+          </w:tcPr>
+          <w:p>
+            <w:r>
+              <w:t>Normal snake overlaps egg → instant transform, egg consumed, lane cleared of normal snakes</w:t>
+            </w:r>
+          </w:p>
+        </w:tc>
+      </w:tr>
+    </w:tbl>
+    <w:p>
+      <w:pPr>
+        <w:rPr>
+          <w:b/>
+          <w:bCs/>
+        </w:rPr>
+      </w:pPr>
+      <w:r>
+        <w:rPr>
+          <w:b/>
+          <w:bCs/>
+        </w:rPr>
+        <w:t>Mode Differences</w:t>
+      </w:r>
+    </w:p>
+    <w:tbl>
+      <w:tblPr>
+        <w:tblW w:w="0" w:type="auto"/>
+        <w:shd w:val="clear" w:color="auto" w:fill="0D1117"/>
+        <w:tblCellMar>
+          <w:top w:w="15" w:type="dxa"/>
+          <w:left w:w="15" w:type="dxa"/>
+          <w:bottom w:w="15" w:type="dxa"/>
+          <w:right w:w="15" w:type="dxa"/>
+        </w:tblCellMar>
+        <w:tblLook w:val="04A0" w:firstRow="1" w:lastRow="0" w:firstColumn="1" w:lastColumn="0" w:noHBand="0" w:noVBand="1"/>
+      </w:tblPr>
+      <w:tblGrid>
+        <w:gridCol w:w="1829"/>
+        <w:gridCol w:w="2916"/>
+        <w:gridCol w:w="4117"/>
+      </w:tblGrid>
+      <w:tr>
+        <w:trPr>
+          <w:tblHeader/>
+        </w:trPr>
+        <w:tc>
+          <w:tcPr>
+            <w:tcW w:w="0" w:type="auto"/>
+            <w:tcBorders>
+              <w:top w:val="single" w:sz="4" w:space="0" w:color="3D444D"/>
+              <w:left w:val="single" w:sz="4" w:space="0" w:color="3D444D"/>
+              <w:bottom w:val="single" w:sz="4" w:space="0" w:color="3D444D"/>
+              <w:right w:val="single" w:sz="4" w:space="0" w:color="3D444D"/>
+            </w:tcBorders>
+            <w:shd w:val="clear" w:color="auto" w:fill="0D1117"/>
+            <w:tcMar>
+              <w:top w:w="90" w:type="dxa"/>
+              <w:left w:w="195" w:type="dxa"/>
+              <w:bottom w:w="90" w:type="dxa"/>
+              <w:right w:w="195" w:type="dxa"/>
+            </w:tcMar>
+            <w:vAlign w:val="center"/>
+            <w:hideMark/>
+          </w:tcPr>
+          <w:p>
+            <w:pPr>
+              <w:rPr>
+                <w:b/>
+                <w:bCs/>
+              </w:rPr>
+            </w:pPr>
+            <w:r>
+              <w:rPr>
+                <w:b/>
+                <w:bCs/>
+              </w:rPr>
+              <w:t>Aspect</w:t>
+            </w:r>
+          </w:p>
+        </w:tc>
+        <w:tc>
+          <w:tcPr>
+            <w:tcW w:w="0" w:type="auto"/>
+            <w:tcBorders>
+              <w:top w:val="single" w:sz="4" w:space="0" w:color="3D444D"/>
+              <w:left w:val="single" w:sz="4" w:space="0" w:color="3D444D"/>
+              <w:bottom w:val="single" w:sz="4" w:space="0" w:color="3D444D"/>
+              <w:right w:val="single" w:sz="4" w:space="0" w:color="3D444D"/>
+            </w:tcBorders>
+            <w:shd w:val="clear" w:color="auto" w:fill="0D1117"/>
+            <w:tcMar>
+              <w:top w:w="90" w:type="dxa"/>
+              <w:left w:w="195" w:type="dxa"/>
+              <w:bottom w:w="90" w:type="dxa"/>
+              <w:right w:w="195" w:type="dxa"/>
+            </w:tcMar>
+            <w:vAlign w:val="center"/>
+            <w:hideMark/>
+          </w:tcPr>
+          <w:p>
+            <w:pPr>
+              <w:rPr>
+                <w:b/>
+                <w:bCs/>
+              </w:rPr>
+            </w:pPr>
+            <w:r>
+              <w:rPr>
+                <w:b/>
+                <w:bCs/>
+              </w:rPr>
+              <w:t>Mode 1: Timed</w:t>
+            </w:r>
+          </w:p>
+        </w:tc>
+        <w:tc>
+          <w:tcPr>
+            <w:tcW w:w="0" w:type="auto"/>
+            <w:tcBorders>
+              <w:top w:val="single" w:sz="4" w:space="0" w:color="3D444D"/>
+              <w:left w:val="single" w:sz="4" w:space="0" w:color="3D444D"/>
+              <w:bottom w:val="single" w:sz="4" w:space="0" w:color="3D444D"/>
+              <w:right w:val="single" w:sz="4" w:space="0" w:color="3D444D"/>
+            </w:tcBorders>
+            <w:shd w:val="clear" w:color="auto" w:fill="0D1117"/>
+            <w:tcMar>
+              <w:top w:w="90" w:type="dxa"/>
+              <w:left w:w="195" w:type="dxa"/>
+              <w:bottom w:w="90" w:type="dxa"/>
+              <w:right w:w="195" w:type="dxa"/>
+            </w:tcMar>
+            <w:vAlign w:val="center"/>
+            <w:hideMark/>
+          </w:tcPr>
+          <w:p>
+            <w:pPr>
+              <w:rPr>
+                <w:b/>
+                <w:bCs/>
+              </w:rPr>
+            </w:pPr>
+            <w:r>
+              <w:rPr>
+                <w:b/>
+                <w:bCs/>
+              </w:rPr>
+              <w:t>Mode 2: Objective</w:t>
+            </w:r>
+          </w:p>
+        </w:tc>
+      </w:tr>
+      <w:tr>
+        <w:tc>
+          <w:tcPr>
+            <w:tcW w:w="0" w:type="auto"/>
+            <w:tcBorders>
+              <w:top w:val="single" w:sz="4" w:space="0" w:color="3D444D"/>
+              <w:left w:val="single" w:sz="4" w:space="0" w:color="3D444D"/>
+              <w:bottom w:val="single" w:sz="4" w:space="0" w:color="3D444D"/>
+              <w:right w:val="single" w:sz="4" w:space="0" w:color="3D444D"/>
+            </w:tcBorders>
+            <w:shd w:val="clear" w:color="auto" w:fill="0D1117"/>
+            <w:tcMar>
+              <w:top w:w="90" w:type="dxa"/>
+              <w:left w:w="195" w:type="dxa"/>
+              <w:bottom w:w="90" w:type="dxa"/>
+              <w:right w:w="195" w:type="dxa"/>
+            </w:tcMar>
+            <w:vAlign w:val="center"/>
+            <w:hideMark/>
+          </w:tcPr>
+          <w:p>
+            <w:r>
+              <w:rPr>
+                <w:b/>
+                <w:bCs/>
+              </w:rPr>
+              <w:t>Duration</w:t>
+            </w:r>
+          </w:p>
+        </w:tc>
+        <w:tc>
+          <w:tcPr>
+            <w:tcW w:w="0" w:type="auto"/>
+            <w:tcBorders>
+              <w:top w:val="single" w:sz="4" w:space="0" w:color="3D444D"/>
+              <w:left w:val="single" w:sz="4" w:space="0" w:color="3D444D"/>
+              <w:bottom w:val="single" w:sz="4" w:space="0" w:color="3D444D"/>
+              <w:right w:val="single" w:sz="4" w:space="0" w:color="3D444D"/>
+            </w:tcBorders>
+            <w:shd w:val="clear" w:color="auto" w:fill="0D1117"/>
+            <w:tcMar>
+              <w:top w:w="90" w:type="dxa"/>
+              <w:left w:w="195" w:type="dxa"/>
+              <w:bottom w:w="90" w:type="dxa"/>
+              <w:right w:w="195" w:type="dxa"/>
+            </w:tcMar>
+            <w:vAlign w:val="center"/>
+            <w:hideMark/>
+          </w:tcPr>
+          <w:p>
+            <w:r>
+              <w:t>90 sec default</w:t>
+            </w:r>
+          </w:p>
+        </w:tc>
+        <w:tc>
+          <w:tcPr>
+            <w:tcW w:w="0" w:type="auto"/>
+            <w:tcBorders>
+              <w:top w:val="single" w:sz="4" w:space="0" w:color="3D444D"/>
+              <w:left w:val="single" w:sz="4" w:space="0" w:color="3D444D"/>
+              <w:bottom w:val="single" w:sz="4" w:space="0" w:color="3D444D"/>
+              <w:right w:val="single" w:sz="4" w:space="0" w:color="3D444D"/>
+            </w:tcBorders>
+            <w:shd w:val="clear" w:color="auto" w:fill="0D1117"/>
+            <w:tcMar>
+              <w:top w:w="90" w:type="dxa"/>
+              <w:left w:w="195" w:type="dxa"/>
+              <w:bottom w:w="90" w:type="dxa"/>
+              <w:right w:w="195" w:type="dxa"/>
+            </w:tcMar>
+            <w:vAlign w:val="center"/>
+            <w:hideMark/>
+          </w:tcPr>
+          <w:p>
+            <w:r>
+              <w:t>Until win/lose</w:t>
+            </w:r>
+          </w:p>
+        </w:tc>
+      </w:tr>
+      <w:tr>
+        <w:tc>
+          <w:tcPr>
+            <w:tcW w:w="0" w:type="auto"/>
+            <w:tcBorders>
+              <w:top w:val="single" w:sz="4" w:space="0" w:color="3D444D"/>
+              <w:left w:val="single" w:sz="4" w:space="0" w:color="3D444D"/>
+              <w:bottom w:val="single" w:sz="4" w:space="0" w:color="3D444D"/>
+              <w:right w:val="single" w:sz="4" w:space="0" w:color="3D444D"/>
+            </w:tcBorders>
+            <w:shd w:val="clear" w:color="auto" w:fill="151B23"/>
+            <w:tcMar>
+              <w:top w:w="90" w:type="dxa"/>
+              <w:left w:w="195" w:type="dxa"/>
+              <w:bottom w:w="90" w:type="dxa"/>
+              <w:right w:w="195" w:type="dxa"/>
+            </w:tcMar>
+            <w:vAlign w:val="center"/>
+            <w:hideMark/>
+          </w:tcPr>
+          <w:p>
+            <w:r>
+              <w:rPr>
+                <w:b/>
+                <w:bCs/>
+              </w:rPr>
+              <w:t>Lives</w:t>
+            </w:r>
+          </w:p>
+        </w:tc>
+        <w:tc>
+          <w:tcPr>
+            <w:tcW w:w="0" w:type="auto"/>
+            <w:tcBorders>
+              <w:top w:val="single" w:sz="4" w:space="0" w:color="3D444D"/>
+              <w:left w:val="single" w:sz="4" w:space="0" w:color="3D444D"/>
+              <w:bottom w:val="single" w:sz="4" w:space="0" w:color="3D444D"/>
+              <w:right w:val="single" w:sz="4" w:space="0" w:color="3D444D"/>
+            </w:tcBorders>
+            <w:shd w:val="clear" w:color="auto" w:fill="151B23"/>
+            <w:tcMar>
+              <w:top w:w="90" w:type="dxa"/>
+              <w:left w:w="195" w:type="dxa"/>
+              <w:bottom w:w="90" w:type="dxa"/>
+              <w:right w:w="195" w:type="dxa"/>
+            </w:tcMar>
+            <w:vAlign w:val="center"/>
+            <w:hideMark/>
+          </w:tcPr>
+          <w:p>
+            <w:r>
+              <w:t>Optional/cosmetic</w:t>
+            </w:r>
+          </w:p>
+        </w:tc>
+        <w:tc>
+          <w:tcPr>
+            <w:tcW w:w="0" w:type="auto"/>
+            <w:tcBorders>
+              <w:top w:val="single" w:sz="4" w:space="0" w:color="3D444D"/>
+              <w:left w:val="single" w:sz="4" w:space="0" w:color="3D444D"/>
+              <w:bottom w:val="single" w:sz="4" w:space="0" w:color="3D444D"/>
+              <w:right w:val="single" w:sz="4" w:space="0" w:color="3D444D"/>
+            </w:tcBorders>
+            <w:shd w:val="clear" w:color="auto" w:fill="151B23"/>
+            <w:tcMar>
+              <w:top w:w="90" w:type="dxa"/>
+              <w:left w:w="195" w:type="dxa"/>
+              <w:bottom w:w="90" w:type="dxa"/>
+              <w:right w:w="195" w:type="dxa"/>
+            </w:tcMar>
+            <w:vAlign w:val="center"/>
+            <w:hideMark/>
+          </w:tcPr>
+          <w:p>
+            <w:r>
+              <w:t xml:space="preserve">3 </w:t>
+            </w:r>
+            <w:proofErr w:type="gramStart"/>
+            <w:r>
+              <w:t>default</w:t>
+            </w:r>
+            <w:proofErr w:type="gramEnd"/>
+            <w:r>
+              <w:t>, lose on depletion</w:t>
+            </w:r>
+          </w:p>
+        </w:tc>
+      </w:tr>
+      <w:tr>
+        <w:tc>
+          <w:tcPr>
+            <w:tcW w:w="0" w:type="auto"/>
+            <w:tcBorders>
+              <w:top w:val="single" w:sz="4" w:space="0" w:color="3D444D"/>
+              <w:left w:val="single" w:sz="4" w:space="0" w:color="3D444D"/>
+              <w:bottom w:val="single" w:sz="4" w:space="0" w:color="3D444D"/>
+              <w:right w:val="single" w:sz="4" w:space="0" w:color="3D444D"/>
+            </w:tcBorders>
+            <w:shd w:val="clear" w:color="auto" w:fill="0D1117"/>
+            <w:tcMar>
+              <w:top w:w="90" w:type="dxa"/>
+              <w:left w:w="195" w:type="dxa"/>
+              <w:bottom w:w="90" w:type="dxa"/>
+              <w:right w:w="195" w:type="dxa"/>
+            </w:tcMar>
+            <w:vAlign w:val="center"/>
+            <w:hideMark/>
+          </w:tcPr>
+          <w:p>
+            <w:r>
+              <w:rPr>
+                <w:b/>
+                <w:bCs/>
+              </w:rPr>
+              <w:t>Hunter Snake</w:t>
+            </w:r>
+          </w:p>
+        </w:tc>
+        <w:tc>
+          <w:tcPr>
+            <w:tcW w:w="0" w:type="auto"/>
+            <w:tcBorders>
+              <w:top w:val="single" w:sz="4" w:space="0" w:color="3D444D"/>
+              <w:left w:val="single" w:sz="4" w:space="0" w:color="3D444D"/>
+              <w:bottom w:val="single" w:sz="4" w:space="0" w:color="3D444D"/>
+              <w:right w:val="single" w:sz="4" w:space="0" w:color="3D444D"/>
+            </w:tcBorders>
+            <w:shd w:val="clear" w:color="auto" w:fill="0D1117"/>
+            <w:tcMar>
+              <w:top w:w="90" w:type="dxa"/>
+              <w:left w:w="195" w:type="dxa"/>
+              <w:bottom w:w="90" w:type="dxa"/>
+              <w:right w:w="195" w:type="dxa"/>
+            </w:tcMar>
+            <w:vAlign w:val="center"/>
+            <w:hideMark/>
+          </w:tcPr>
+          <w:p>
+            <w:r>
+              <w:t>Disabled</w:t>
+            </w:r>
+          </w:p>
+        </w:tc>
+        <w:tc>
+          <w:tcPr>
+            <w:tcW w:w="0" w:type="auto"/>
+            <w:tcBorders>
+              <w:top w:val="single" w:sz="4" w:space="0" w:color="3D444D"/>
+              <w:left w:val="single" w:sz="4" w:space="0" w:color="3D444D"/>
+              <w:bottom w:val="single" w:sz="4" w:space="0" w:color="3D444D"/>
+              <w:right w:val="single" w:sz="4" w:space="0" w:color="3D444D"/>
+            </w:tcBorders>
+            <w:shd w:val="clear" w:color="auto" w:fill="0D1117"/>
+            <w:tcMar>
+              <w:top w:w="90" w:type="dxa"/>
+              <w:left w:w="195" w:type="dxa"/>
+              <w:bottom w:w="90" w:type="dxa"/>
+              <w:right w:w="195" w:type="dxa"/>
+            </w:tcMar>
+            <w:vAlign w:val="center"/>
+            <w:hideMark/>
+          </w:tcPr>
+          <w:p>
+            <w:r>
+              <w:t>Enabled, win condition</w:t>
+            </w:r>
+          </w:p>
+        </w:tc>
+      </w:tr>
+      <w:tr>
+        <w:tc>
+          <w:tcPr>
+            <w:tcW w:w="0" w:type="auto"/>
+            <w:tcBorders>
+              <w:top w:val="single" w:sz="4" w:space="0" w:color="3D444D"/>
+              <w:left w:val="single" w:sz="4" w:space="0" w:color="3D444D"/>
+              <w:bottom w:val="single" w:sz="4" w:space="0" w:color="3D444D"/>
+              <w:right w:val="single" w:sz="4" w:space="0" w:color="3D444D"/>
+            </w:tcBorders>
+            <w:shd w:val="clear" w:color="auto" w:fill="151B23"/>
+            <w:tcMar>
+              <w:top w:w="90" w:type="dxa"/>
+              <w:left w:w="195" w:type="dxa"/>
+              <w:bottom w:w="90" w:type="dxa"/>
+              <w:right w:w="195" w:type="dxa"/>
+            </w:tcMar>
+            <w:vAlign w:val="center"/>
+            <w:hideMark/>
+          </w:tcPr>
+          <w:p>
+            <w:r>
+              <w:rPr>
+                <w:b/>
+                <w:bCs/>
+              </w:rPr>
+              <w:t>Win Condition</w:t>
+            </w:r>
+          </w:p>
+        </w:tc>
+        <w:tc>
+          <w:tcPr>
+            <w:tcW w:w="0" w:type="auto"/>
+            <w:tcBorders>
+              <w:top w:val="single" w:sz="4" w:space="0" w:color="3D444D"/>
+              <w:left w:val="single" w:sz="4" w:space="0" w:color="3D444D"/>
+              <w:bottom w:val="single" w:sz="4" w:space="0" w:color="3D444D"/>
+              <w:right w:val="single" w:sz="4" w:space="0" w:color="3D444D"/>
+            </w:tcBorders>
+            <w:shd w:val="clear" w:color="auto" w:fill="151B23"/>
+            <w:tcMar>
+              <w:top w:w="90" w:type="dxa"/>
+              <w:left w:w="195" w:type="dxa"/>
+              <w:bottom w:w="90" w:type="dxa"/>
+              <w:right w:w="195" w:type="dxa"/>
+            </w:tcMar>
+            <w:vAlign w:val="center"/>
+            <w:hideMark/>
+          </w:tcPr>
+          <w:p>
+            <w:r>
+              <w:t>Timer expires, highest score</w:t>
+            </w:r>
+          </w:p>
+        </w:tc>
+        <w:tc>
+          <w:tcPr>
+            <w:tcW w:w="0" w:type="auto"/>
+            <w:tcBorders>
+              <w:top w:val="single" w:sz="4" w:space="0" w:color="3D444D"/>
+              <w:left w:val="single" w:sz="4" w:space="0" w:color="3D444D"/>
+              <w:bottom w:val="single" w:sz="4" w:space="0" w:color="3D444D"/>
+              <w:right w:val="single" w:sz="4" w:space="0" w:color="3D444D"/>
+            </w:tcBorders>
+            <w:shd w:val="clear" w:color="auto" w:fill="151B23"/>
+            <w:tcMar>
+              <w:top w:w="90" w:type="dxa"/>
+              <w:left w:w="195" w:type="dxa"/>
+              <w:bottom w:w="90" w:type="dxa"/>
+              <w:right w:w="195" w:type="dxa"/>
+            </w:tcMar>
+            <w:vAlign w:val="center"/>
+            <w:hideMark/>
+          </w:tcPr>
+          <w:p>
+            <w:r>
+              <w:t>Destroy all Hunter Snake(s)</w:t>
+            </w:r>
+          </w:p>
+        </w:tc>
+      </w:tr>
+      <w:tr>
+        <w:tc>
+          <w:tcPr>
+            <w:tcW w:w="0" w:type="auto"/>
+            <w:tcBorders>
+              <w:top w:val="single" w:sz="4" w:space="0" w:color="3D444D"/>
+              <w:left w:val="single" w:sz="4" w:space="0" w:color="3D444D"/>
+              <w:bottom w:val="single" w:sz="4" w:space="0" w:color="3D444D"/>
+              <w:right w:val="single" w:sz="4" w:space="0" w:color="3D444D"/>
+            </w:tcBorders>
+            <w:shd w:val="clear" w:color="auto" w:fill="0D1117"/>
+            <w:tcMar>
+              <w:top w:w="90" w:type="dxa"/>
+              <w:left w:w="195" w:type="dxa"/>
+              <w:bottom w:w="90" w:type="dxa"/>
+              <w:right w:w="195" w:type="dxa"/>
+            </w:tcMar>
+            <w:vAlign w:val="center"/>
+            <w:hideMark/>
+          </w:tcPr>
+          <w:p>
+            <w:r>
+              <w:rPr>
+                <w:b/>
+                <w:bCs/>
+              </w:rPr>
+              <w:t>Lose Condition</w:t>
+            </w:r>
+          </w:p>
+        </w:tc>
+        <w:tc>
+          <w:tcPr>
+            <w:tcW w:w="0" w:type="auto"/>
+            <w:tcBorders>
+              <w:top w:val="single" w:sz="4" w:space="0" w:color="3D444D"/>
+              <w:left w:val="single" w:sz="4" w:space="0" w:color="3D444D"/>
+              <w:bottom w:val="single" w:sz="4" w:space="0" w:color="3D444D"/>
+              <w:right w:val="single" w:sz="4" w:space="0" w:color="3D444D"/>
+            </w:tcBorders>
+            <w:shd w:val="clear" w:color="auto" w:fill="0D1117"/>
+            <w:tcMar>
+              <w:top w:w="90" w:type="dxa"/>
+              <w:left w:w="195" w:type="dxa"/>
+              <w:bottom w:w="90" w:type="dxa"/>
+              <w:right w:w="195" w:type="dxa"/>
+            </w:tcMar>
+            <w:vAlign w:val="center"/>
+            <w:hideMark/>
+          </w:tcPr>
+          <w:p>
+            <w:r>
+              <w:t>N/A (stays in game)</w:t>
+            </w:r>
+          </w:p>
+        </w:tc>
+        <w:tc>
+          <w:tcPr>
+            <w:tcW w:w="0" w:type="auto"/>
+            <w:tcBorders>
+              <w:top w:val="single" w:sz="4" w:space="0" w:color="3D444D"/>
+              <w:left w:val="single" w:sz="4" w:space="0" w:color="3D444D"/>
+              <w:bottom w:val="single" w:sz="4" w:space="0" w:color="3D444D"/>
+              <w:right w:val="single" w:sz="4" w:space="0" w:color="3D444D"/>
+            </w:tcBorders>
+            <w:shd w:val="clear" w:color="auto" w:fill="0D1117"/>
+            <w:tcMar>
+              <w:top w:w="90" w:type="dxa"/>
+              <w:left w:w="195" w:type="dxa"/>
+              <w:bottom w:w="90" w:type="dxa"/>
+              <w:right w:w="195" w:type="dxa"/>
+            </w:tcMar>
+            <w:vAlign w:val="center"/>
+            <w:hideMark/>
+          </w:tcPr>
+          <w:p>
+            <w:r>
+              <w:t>All lives lost</w:t>
+            </w:r>
+          </w:p>
+        </w:tc>
+      </w:tr>
+      <w:tr>
+        <w:tc>
+          <w:tcPr>
+            <w:tcW w:w="0" w:type="auto"/>
+            <w:tcBorders>
+              <w:top w:val="single" w:sz="4" w:space="0" w:color="3D444D"/>
+              <w:left w:val="single" w:sz="4" w:space="0" w:color="3D444D"/>
+              <w:bottom w:val="single" w:sz="4" w:space="0" w:color="3D444D"/>
+              <w:right w:val="single" w:sz="4" w:space="0" w:color="3D444D"/>
+            </w:tcBorders>
+            <w:shd w:val="clear" w:color="auto" w:fill="151B23"/>
+            <w:tcMar>
+              <w:top w:w="90" w:type="dxa"/>
+              <w:left w:w="195" w:type="dxa"/>
+              <w:bottom w:w="90" w:type="dxa"/>
+              <w:right w:w="195" w:type="dxa"/>
+            </w:tcMar>
+            <w:vAlign w:val="center"/>
+            <w:hideMark/>
+          </w:tcPr>
+          <w:p>
+            <w:r>
+              <w:rPr>
+                <w:b/>
+                <w:bCs/>
+              </w:rPr>
+              <w:t>On Player Hit</w:t>
+            </w:r>
+          </w:p>
+        </w:tc>
+        <w:tc>
+          <w:tcPr>
+            <w:tcW w:w="0" w:type="auto"/>
+            <w:tcBorders>
+              <w:top w:val="single" w:sz="4" w:space="0" w:color="3D444D"/>
+              <w:left w:val="single" w:sz="4" w:space="0" w:color="3D444D"/>
+              <w:bottom w:val="single" w:sz="4" w:space="0" w:color="3D444D"/>
+              <w:right w:val="single" w:sz="4" w:space="0" w:color="3D444D"/>
+            </w:tcBorders>
+            <w:shd w:val="clear" w:color="auto" w:fill="151B23"/>
+            <w:tcMar>
+              <w:top w:w="90" w:type="dxa"/>
+              <w:left w:w="195" w:type="dxa"/>
+              <w:bottom w:w="90" w:type="dxa"/>
+              <w:right w:w="195" w:type="dxa"/>
+            </w:tcMar>
+            <w:vAlign w:val="center"/>
+            <w:hideMark/>
+          </w:tcPr>
+          <w:p>
+            <w:r>
+              <w:t xml:space="preserve">Penalty points, brief </w:t>
+            </w:r>
+            <w:proofErr w:type="spellStart"/>
+            <w:r>
+              <w:t>invuln</w:t>
+            </w:r>
+            <w:proofErr w:type="spellEnd"/>
+          </w:p>
+        </w:tc>
+        <w:tc>
+          <w:tcPr>
+            <w:tcW w:w="0" w:type="auto"/>
+            <w:tcBorders>
+              <w:top w:val="single" w:sz="4" w:space="0" w:color="3D444D"/>
+              <w:left w:val="single" w:sz="4" w:space="0" w:color="3D444D"/>
+              <w:bottom w:val="single" w:sz="4" w:space="0" w:color="3D444D"/>
+              <w:right w:val="single" w:sz="4" w:space="0" w:color="3D444D"/>
+            </w:tcBorders>
+            <w:shd w:val="clear" w:color="auto" w:fill="151B23"/>
+            <w:tcMar>
+              <w:top w:w="90" w:type="dxa"/>
+              <w:left w:w="195" w:type="dxa"/>
+              <w:bottom w:w="90" w:type="dxa"/>
+              <w:right w:w="195" w:type="dxa"/>
+            </w:tcMar>
+            <w:vAlign w:val="center"/>
+            <w:hideMark/>
+          </w:tcPr>
+          <w:p>
+            <w:r>
+              <w:t xml:space="preserve">Lose life, lose pixel, brief </w:t>
+            </w:r>
+            <w:proofErr w:type="spellStart"/>
+            <w:r>
+              <w:t>invuln</w:t>
+            </w:r>
+            <w:proofErr w:type="spellEnd"/>
+            <w:r>
+              <w:t xml:space="preserve"> with blink</w:t>
+            </w:r>
+          </w:p>
+        </w:tc>
+      </w:tr>
+    </w:tbl>
+    <w:p>
+      <w:pPr>
+        <w:rPr>
+          <w:b/>
+          <w:bCs/>
+        </w:rPr>
+      </w:pPr>
+      <w:r>
+        <w:rPr>
+          <w:b/>
+          <w:bCs/>
+        </w:rPr>
+        <w:t>Life/Death Visual</w:t>
+      </w:r>
+    </w:p>
+    <w:p>
+      <w:r>
+        <w:t>Lives displayed as contiguous pixels, lost in order: bottom → top → new bottom → new top → center (alternating from edges inward). On hit: remaining pixels blink rapidly for ~1 sec (configurable invulnerability).</w:t>
+      </w:r>
+    </w:p>
+    <w:p>
+      <w:pPr>
+        <w:rPr>
+          <w:b/>
+          <w:bCs/>
+        </w:rPr>
+      </w:pPr>
+      <w:r>
+        <w:rPr>
+          <w:b/>
+          <w:bCs/>
+        </w:rPr>
+        <w:t>Hunter Snake Details</w:t>
+      </w:r>
+    </w:p>
+    <w:p>
+      <w:pPr>
+        <w:numPr>
+          <w:ilvl w:val="0"/>
+          <w:numId w:val="10"/>
+        </w:numPr>
+      </w:pPr>
+      <w:r>
+        <w:rPr>
+          <w:b/>
+          <w:bCs/>
+        </w:rPr>
+        <w:t>Appearance</w:t>
+      </w:r>
+      <w:r>
+        <w:t>: White head (red if original color was white) + colored body</w:t>
+      </w:r>
+    </w:p>
+    <w:p>
+      <w:pPr>
+        <w:numPr>
+          <w:ilvl w:val="0"/>
+          <w:numId w:val="10"/>
+        </w:numPr>
+      </w:pPr>
+      <w:r>
+        <w:rPr>
+          <w:b/>
+          <w:bCs/>
+        </w:rPr>
+        <w:t>Damage (Front)</w:t>
+      </w:r>
+      <w:r>
+        <w:t>: size × 2 hits required, separate counter</w:t>
+      </w:r>
+    </w:p>
+    <w:p>
+      <w:pPr>
+        <w:numPr>
+          <w:ilvl w:val="0"/>
+          <w:numId w:val="10"/>
+        </w:numPr>
+      </w:pPr>
+      <w:r>
+        <w:rPr>
+          <w:b/>
+          <w:bCs/>
+        </w:rPr>
+        <w:t>Damage (Rear)</w:t>
+      </w:r>
+      <w:r>
+        <w:t>: 3 hits per segment, separate counter</w:t>
+      </w:r>
+    </w:p>
+    <w:p>
+      <w:pPr>
+        <w:numPr>
+          <w:ilvl w:val="0"/>
+          <w:numId w:val="10"/>
+        </w:numPr>
+      </w:pPr>
+      <w:r>
+        <w:rPr>
+          <w:b/>
+          <w:bCs/>
+        </w:rPr>
+        <w:t>Counters don't combine</w:t>
+      </w:r>
+      <w:r>
+        <w:t>: Must fully destroy from one direction</w:t>
+      </w:r>
+    </w:p>
+    <w:p>
+      <w:pPr>
+        <w:numPr>
+          <w:ilvl w:val="0"/>
+          <w:numId w:val="10"/>
+        </w:numPr>
+      </w:pPr>
+      <w:r>
+        <w:rPr>
+          <w:b/>
+          <w:bCs/>
+        </w:rPr>
+        <w:t>U-Turn</w:t>
+      </w:r>
+      <w:r>
+        <w:t>: Exits pixel-by-pixel, re-emerges from same end going opposite direction, front/rear swap</w:t>
+      </w:r>
+    </w:p>
+    <w:p>
+      <w:pPr>
+        <w:numPr>
+          <w:ilvl w:val="0"/>
+          <w:numId w:val="10"/>
+        </w:numPr>
+      </w:pPr>
+      <w:r>
+        <w:rPr>
+          <w:b/>
+          <w:bCs/>
+        </w:rPr>
+        <w:t>Lane Reservation</w:t>
+      </w:r>
+      <w:r>
+        <w:t>: 1 Hunter per lane max, both lanes can have Hunter simultaneously</w:t>
+      </w:r>
+    </w:p>
+    <w:p>
+      <w:pPr>
+        <w:numPr>
+          <w:ilvl w:val="0"/>
+          <w:numId w:val="10"/>
+        </w:numPr>
+      </w:pPr>
+      <w:r>
+        <w:rPr>
+          <w:b/>
+          <w:bCs/>
+        </w:rPr>
+        <w:t>Win</w:t>
+      </w:r>
+      <w:r>
+        <w:t>: Destroy all active Hunters (1 or 2 depending on config)</w:t>
+      </w:r>
+    </w:p>
+    <w:p>
+      <w:pPr>
+        <w:rPr>
+          <w:b/>
+          <w:bCs/>
+        </w:rPr>
+      </w:pPr>
+      <w:r>
+        <w:rPr>
+          <w:b/>
+          <w:bCs/>
+        </w:rPr>
+        <w:t>Console Changes</w:t>
+      </w:r>
+    </w:p>
+    <w:p>
+      <w:r>
+        <w:t>New toggle button between "Config" and "Scoreboard":</w:t>
+      </w:r>
+    </w:p>
+    <w:p>
+      <w:r>
+        <w:t>Code</w:t>
+      </w:r>
+    </w:p>
+    <w:p>
+      <w:r>
+        <w:t>┌─────────────────┐</w:t>
+      </w:r>
+    </w:p>
+    <w:p>
+      <w:r>
+        <w:t>│     MODE 1      │</w:t>
+      </w:r>
+    </w:p>
+    <w:p>
+      <w:r>
+        <w:t>│     Timed       │</w:t>
+      </w:r>
+    </w:p>
+    <w:p>
+      <w:r>
+        <w:t>└─────────────────┘</w:t>
+      </w:r>
+    </w:p>
+    <w:p>
+      <w:pPr>
+        <w:numPr>
+          <w:ilvl w:val="0"/>
+          <w:numId w:val="11"/>
+        </w:numPr>
+      </w:pPr>
+      <w:r>
+        <w:t>Click toggles between Mode 1/Mode 2</w:t>
+      </w:r>
+    </w:p>
+    <w:p>
+      <w:pPr>
+        <w:numPr>
+          <w:ilvl w:val="0"/>
+          <w:numId w:val="11"/>
+        </w:numPr>
+      </w:pPr>
+      <w:r>
+        <w:t>Grayed out for games without modes (Dot Dash, Pixel Pop)</w:t>
+      </w:r>
+    </w:p>
+    <w:p>
+      <w:pPr>
+        <w:numPr>
+          <w:ilvl w:val="0"/>
+          <w:numId w:val="11"/>
+        </w:numPr>
+      </w:pPr>
+      <w:r>
+        <w:t>Selecting mode then clicking Config opens that mode's config</w:t>
+      </w:r>
+    </w:p>
+    <w:p>
+      <w:pPr>
+        <w:rPr>
+          <w:b/>
+          <w:bCs/>
+        </w:rPr>
+      </w:pPr>
+      <w:r>
+        <w:rPr>
+          <w:b/>
+          <w:bCs/>
+        </w:rPr>
+        <w:t>File Structure</w:t>
+      </w:r>
+    </w:p>
+    <w:p>
+      <w:r>
+        <w:t>Code</w:t>
+      </w:r>
+    </w:p>
+    <w:p>
+      <w:r>
+        <w:t>games/surround/</w:t>
+      </w:r>
+    </w:p>
+    <w:p>
+      <w:r>
+        <w:rPr>
+          <w:rFonts w:ascii="MS Gothic" w:eastAsia="MS Gothic" w:hAnsi="MS Gothic" w:cs="MS Gothic" w:hint="eastAsia"/>
+        </w:rPr>
+        <w:t>├</w:t>
+      </w:r>
+      <w:r>
+        <w:rPr>
+          <w:rFonts w:cs="Aptos"/>
+        </w:rPr>
+        <w:t>──</w:t>
+      </w:r>
+      <w:r>
+        <w:t xml:space="preserve"> __init__.py</w:t>
+      </w:r>
+    </w:p>
+    <w:p>
+      <w:r>
+        <w:rPr>
+          <w:rFonts w:ascii="MS Gothic" w:eastAsia="MS Gothic" w:hAnsi="MS Gothic" w:cs="MS Gothic" w:hint="eastAsia"/>
+        </w:rPr>
+        <w:t>├</w:t>
+      </w:r>
+      <w:r>
+        <w:rPr>
+          <w:rFonts w:cs="Aptos"/>
+        </w:rPr>
+        <w:t>──</w:t>
+      </w:r>
+      <w:r>
+        <w:t xml:space="preserve"> surround.py</w:t>
+      </w:r>
+    </w:p>
+    <w:p>
+      <w:r>
+        <w:rPr>
+          <w:rFonts w:ascii="MS Gothic" w:eastAsia="MS Gothic" w:hAnsi="MS Gothic" w:cs="MS Gothic" w:hint="eastAsia"/>
+        </w:rPr>
+        <w:t>├</w:t>
+      </w:r>
+      <w:r>
+        <w:rPr>
+          <w:rFonts w:cs="Aptos"/>
+        </w:rPr>
+        <w:t>──</w:t>
+      </w:r>
+      <w:r>
+        <w:t xml:space="preserve"> snake.py</w:t>
+      </w:r>
+    </w:p>
+    <w:p>
+      <w:r>
+        <w:rPr>
+          <w:rFonts w:ascii="MS Gothic" w:eastAsia="MS Gothic" w:hAnsi="MS Gothic" w:cs="MS Gothic" w:hint="eastAsia"/>
+        </w:rPr>
+        <w:t>├</w:t>
+      </w:r>
+      <w:r>
+        <w:rPr>
+          <w:rFonts w:cs="Aptos"/>
+        </w:rPr>
+        <w:t>──</w:t>
+      </w:r>
+      <w:r>
+        <w:t xml:space="preserve"> egg.py</w:t>
+      </w:r>
+    </w:p>
+    <w:p>
+      <w:r>
+        <w:rPr>
+          <w:rFonts w:ascii="MS Gothic" w:eastAsia="MS Gothic" w:hAnsi="MS Gothic" w:cs="MS Gothic" w:hint="eastAsia"/>
+        </w:rPr>
+        <w:t>├</w:t>
+      </w:r>
+      <w:r>
+        <w:rPr>
+          <w:rFonts w:cs="Aptos"/>
+        </w:rPr>
+        <w:t>──</w:t>
+      </w:r>
+      <w:r>
+        <w:t xml:space="preserve"> player.py</w:t>
+      </w:r>
+    </w:p>
+    <w:p>
+      <w:r>
+        <w:rPr>
+          <w:rFonts w:ascii="MS Gothic" w:eastAsia="MS Gothic" w:hAnsi="MS Gothic" w:cs="MS Gothic" w:hint="eastAsia"/>
+        </w:rPr>
+        <w:t>├</w:t>
+      </w:r>
+      <w:r>
+        <w:rPr>
+          <w:rFonts w:cs="Aptos"/>
+        </w:rPr>
+        <w:t>──</w:t>
+      </w:r>
+      <w:r>
+        <w:t xml:space="preserve"> config_mode1.json</w:t>
+      </w:r>
+    </w:p>
+    <w:p>
+      <w:r>
+        <w:t>└── config_mode2.json</w:t>
+      </w:r>
+    </w:p>
     <w:p/>
-    <w:p/>
-    <w:p/>
-    <w:p/>
-    <w:p/>
-    <w:p/>
-    <w:p/>
-    <w:p/>
-    <w:p/>
-    <w:p/>
-    <w:p/>
-    <w:p/>
-    <w:p/>
-    <w:p/>
-    <w:p/>
-    <w:p/>
+    <w:p>
+      <w:r>
+        <w:t>assets/sounds/</w:t>
+      </w:r>
+    </w:p>
+    <w:p>
+      <w:r>
+        <w:rPr>
+          <w:rFonts w:ascii="MS Gothic" w:eastAsia="MS Gothic" w:hAnsi="MS Gothic" w:cs="MS Gothic" w:hint="eastAsia"/>
+        </w:rPr>
+        <w:t>├</w:t>
+      </w:r>
+      <w:r>
+        <w:rPr>
+          <w:rFonts w:cs="Aptos"/>
+        </w:rPr>
+        <w:t>──</w:t>
+      </w:r>
+      <w:r>
+        <w:t xml:space="preserve"> sr_music_mode1.ogg</w:t>
+      </w:r>
+    </w:p>
+    <w:p>
+      <w:r>
+        <w:rPr>
+          <w:rFonts w:ascii="MS Gothic" w:eastAsia="MS Gothic" w:hAnsi="MS Gothic" w:cs="MS Gothic" w:hint="eastAsia"/>
+        </w:rPr>
+        <w:t>├</w:t>
+      </w:r>
+      <w:r>
+        <w:rPr>
+          <w:rFonts w:cs="Aptos"/>
+        </w:rPr>
+        <w:t>──</w:t>
+      </w:r>
+      <w:r>
+        <w:t xml:space="preserve"> sr_music_mode2.ogg</w:t>
+      </w:r>
+    </w:p>
+    <w:p>
+      <w:r>
+        <w:rPr>
+          <w:rFonts w:ascii="MS Gothic" w:eastAsia="MS Gothic" w:hAnsi="MS Gothic" w:cs="MS Gothic" w:hint="eastAsia"/>
+        </w:rPr>
+        <w:t>├</w:t>
+      </w:r>
+      <w:r>
+        <w:rPr>
+          <w:rFonts w:cs="Aptos"/>
+        </w:rPr>
+        <w:t>──</w:t>
+      </w:r>
+      <w:r>
+        <w:t xml:space="preserve"> sr_shot_fire.wav</w:t>
+      </w:r>
+    </w:p>
+    <w:p>
+      <w:r>
+        <w:rPr>
+          <w:rFonts w:ascii="MS Gothic" w:eastAsia="MS Gothic" w:hAnsi="MS Gothic" w:cs="MS Gothic" w:hint="eastAsia"/>
+        </w:rPr>
+        <w:t>├</w:t>
+      </w:r>
+      <w:r>
+        <w:rPr>
+          <w:rFonts w:cs="Aptos"/>
+        </w:rPr>
+        <w:t>──</w:t>
+      </w:r>
+      <w:r>
+        <w:t xml:space="preserve"> sr_shot_blocked.wav</w:t>
+      </w:r>
+    </w:p>
+    <w:p>
+      <w:r>
+        <w:rPr>
+          <w:rFonts w:ascii="MS Gothic" w:eastAsia="MS Gothic" w:hAnsi="MS Gothic" w:cs="MS Gothic" w:hint="eastAsia"/>
+        </w:rPr>
+        <w:t>├</w:t>
+      </w:r>
+      <w:r>
+        <w:rPr>
+          <w:rFonts w:cs="Aptos"/>
+        </w:rPr>
+        <w:t>──</w:t>
+      </w:r>
+      <w:r>
+        <w:t xml:space="preserve"> sr_shot_hit_correct.wav</w:t>
+      </w:r>
+    </w:p>
+    <w:p>
+      <w:r>
+        <w:rPr>
+          <w:rFonts w:ascii="MS Gothic" w:eastAsia="MS Gothic" w:hAnsi="MS Gothic" w:cs="MS Gothic" w:hint="eastAsia"/>
+        </w:rPr>
+        <w:t>├</w:t>
+      </w:r>
+      <w:r>
+        <w:rPr>
+          <w:rFonts w:cs="Aptos"/>
+        </w:rPr>
+        <w:t>──</w:t>
+      </w:r>
+      <w:r>
+        <w:t xml:space="preserve"> sr_shot_hit_wrong.wav</w:t>
+      </w:r>
+    </w:p>
+    <w:p>
+      <w:r>
+        <w:rPr>
+          <w:rFonts w:ascii="MS Gothic" w:eastAsia="MS Gothic" w:hAnsi="MS Gothic" w:cs="MS Gothic" w:hint="eastAsia"/>
+        </w:rPr>
+        <w:t>├</w:t>
+      </w:r>
+      <w:r>
+        <w:rPr>
+          <w:rFonts w:cs="Aptos"/>
+        </w:rPr>
+        <w:t>──</w:t>
+      </w:r>
+      <w:r>
+        <w:t xml:space="preserve"> sr_snake_destroy.wav</w:t>
+      </w:r>
+    </w:p>
+    <w:p>
+      <w:r>
+        <w:rPr>
+          <w:rFonts w:ascii="MS Gothic" w:eastAsia="MS Gothic" w:hAnsi="MS Gothic" w:cs="MS Gothic" w:hint="eastAsia"/>
+        </w:rPr>
+        <w:t>├</w:t>
+      </w:r>
+      <w:r>
+        <w:rPr>
+          <w:rFonts w:cs="Aptos"/>
+        </w:rPr>
+        <w:t>──</w:t>
+      </w:r>
+      <w:r>
+        <w:t xml:space="preserve"> sr_egg_spawn.wav</w:t>
+      </w:r>
+    </w:p>
+    <w:p>
+      <w:r>
+        <w:rPr>
+          <w:rFonts w:ascii="MS Gothic" w:eastAsia="MS Gothic" w:hAnsi="MS Gothic" w:cs="MS Gothic" w:hint="eastAsia"/>
+        </w:rPr>
+        <w:t>├</w:t>
+      </w:r>
+      <w:r>
+        <w:rPr>
+          <w:rFonts w:cs="Aptos"/>
+        </w:rPr>
+        <w:t>──</w:t>
+      </w:r>
+      <w:r>
+        <w:t xml:space="preserve"> sr_egg_pulse.wav</w:t>
+      </w:r>
+    </w:p>
+    <w:p>
+      <w:r>
+        <w:rPr>
+          <w:rFonts w:ascii="MS Gothic" w:eastAsia="MS Gothic" w:hAnsi="MS Gothic" w:cs="MS Gothic" w:hint="eastAsia"/>
+        </w:rPr>
+        <w:t>├</w:t>
+      </w:r>
+      <w:r>
+        <w:rPr>
+          <w:rFonts w:cs="Aptos"/>
+        </w:rPr>
+        <w:t>──</w:t>
+      </w:r>
+      <w:r>
+        <w:t xml:space="preserve"> sr_egg_collect.wav</w:t>
+      </w:r>
+    </w:p>
+    <w:p>
+      <w:r>
+        <w:rPr>
+          <w:rFonts w:ascii="MS Gothic" w:eastAsia="MS Gothic" w:hAnsi="MS Gothic" w:cs="MS Gothic" w:hint="eastAsia"/>
+        </w:rPr>
+        <w:t>├</w:t>
+      </w:r>
+      <w:r>
+        <w:rPr>
+          <w:rFonts w:cs="Aptos"/>
+        </w:rPr>
+        <w:t>──</w:t>
+      </w:r>
+      <w:r>
+        <w:t xml:space="preserve"> sr_egg_hatch.wav</w:t>
+      </w:r>
+    </w:p>
+    <w:p>
+      <w:r>
+        <w:rPr>
+          <w:rFonts w:ascii="MS Gothic" w:eastAsia="MS Gothic" w:hAnsi="MS Gothic" w:cs="MS Gothic" w:hint="eastAsia"/>
+        </w:rPr>
+        <w:t>├</w:t>
+      </w:r>
+      <w:r>
+        <w:rPr>
+          <w:rFonts w:cs="Aptos"/>
+        </w:rPr>
+        <w:t>──</w:t>
+      </w:r>
+      <w:r>
+        <w:t xml:space="preserve"> sr_hunter_spawn.wav</w:t>
+      </w:r>
+    </w:p>
+    <w:p>
+      <w:r>
+        <w:rPr>
+          <w:rFonts w:ascii="MS Gothic" w:eastAsia="MS Gothic" w:hAnsi="MS Gothic" w:cs="MS Gothic" w:hint="eastAsia"/>
+        </w:rPr>
+        <w:t>├</w:t>
+      </w:r>
+      <w:r>
+        <w:rPr>
+          <w:rFonts w:cs="Aptos"/>
+        </w:rPr>
+        <w:t>──</w:t>
+      </w:r>
+      <w:r>
+        <w:t xml:space="preserve"> sr_hunter_fire.wav</w:t>
+      </w:r>
+    </w:p>
+    <w:p>
+      <w:r>
+        <w:rPr>
+          <w:rFonts w:ascii="MS Gothic" w:eastAsia="MS Gothic" w:hAnsi="MS Gothic" w:cs="MS Gothic" w:hint="eastAsia"/>
+        </w:rPr>
+        <w:t>├</w:t>
+      </w:r>
+      <w:r>
+        <w:rPr>
+          <w:rFonts w:cs="Aptos"/>
+        </w:rPr>
+        <w:t>──</w:t>
+      </w:r>
+      <w:r>
+        <w:t xml:space="preserve"> sr_hunter_hit.wav</w:t>
+      </w:r>
+    </w:p>
+    <w:p>
+      <w:r>
+        <w:rPr>
+          <w:rFonts w:ascii="MS Gothic" w:eastAsia="MS Gothic" w:hAnsi="MS Gothic" w:cs="MS Gothic" w:hint="eastAsia"/>
+        </w:rPr>
+        <w:t>├</w:t>
+      </w:r>
+      <w:r>
+        <w:rPr>
+          <w:rFonts w:cs="Aptos"/>
+        </w:rPr>
+        <w:t>──</w:t>
+      </w:r>
+      <w:r>
+        <w:t xml:space="preserve"> sr_hunter_destroy.wav</w:t>
+      </w:r>
+    </w:p>
+    <w:p>
+      <w:r>
+        <w:rPr>
+          <w:rFonts w:ascii="MS Gothic" w:eastAsia="MS Gothic" w:hAnsi="MS Gothic" w:cs="MS Gothic" w:hint="eastAsia"/>
+        </w:rPr>
+        <w:t>├</w:t>
+      </w:r>
+      <w:r>
+        <w:rPr>
+          <w:rFonts w:cs="Aptos"/>
+        </w:rPr>
+        <w:t>──</w:t>
+      </w:r>
+      <w:r>
+        <w:t xml:space="preserve"> sr_baby_spawn.wav</w:t>
+      </w:r>
+    </w:p>
+    <w:p>
+      <w:r>
+        <w:rPr>
+          <w:rFonts w:ascii="MS Gothic" w:eastAsia="MS Gothic" w:hAnsi="MS Gothic" w:cs="MS Gothic" w:hint="eastAsia"/>
+        </w:rPr>
+        <w:t>├</w:t>
+      </w:r>
+      <w:r>
+        <w:rPr>
+          <w:rFonts w:cs="Aptos"/>
+        </w:rPr>
+        <w:t>──</w:t>
+      </w:r>
+      <w:r>
+        <w:t xml:space="preserve"> sr_player_hit.wav</w:t>
+      </w:r>
+    </w:p>
+    <w:p>
+      <w:r>
+        <w:rPr>
+          <w:rFonts w:ascii="MS Gothic" w:eastAsia="MS Gothic" w:hAnsi="MS Gothic" w:cs="MS Gothic" w:hint="eastAsia"/>
+        </w:rPr>
+        <w:t>├</w:t>
+      </w:r>
+      <w:r>
+        <w:rPr>
+          <w:rFonts w:cs="Aptos"/>
+        </w:rPr>
+        <w:t>──</w:t>
+      </w:r>
+      <w:r>
+        <w:t xml:space="preserve"> sr_player_respawn.wav</w:t>
+      </w:r>
+    </w:p>
+    <w:p>
+      <w:r>
+        <w:rPr>
+          <w:rFonts w:ascii="MS Gothic" w:eastAsia="MS Gothic" w:hAnsi="MS Gothic" w:cs="MS Gothic" w:hint="eastAsia"/>
+        </w:rPr>
+        <w:t>├</w:t>
+      </w:r>
+      <w:r>
+        <w:rPr>
+          <w:rFonts w:cs="Aptos"/>
+        </w:rPr>
+        <w:t>──</w:t>
+      </w:r>
+      <w:r>
+        <w:t xml:space="preserve"> sr_extra_life.wav</w:t>
+      </w:r>
+    </w:p>
+    <w:p>
+      <w:r>
+        <w:rPr>
+          <w:rFonts w:ascii="MS Gothic" w:eastAsia="MS Gothic" w:hAnsi="MS Gothic" w:cs="MS Gothic" w:hint="eastAsia"/>
+        </w:rPr>
+        <w:t>├</w:t>
+      </w:r>
+      <w:r>
+        <w:rPr>
+          <w:rFonts w:cs="Aptos"/>
+        </w:rPr>
+        <w:t>──</w:t>
+      </w:r>
+      <w:r>
+        <w:t xml:space="preserve"> sr_round_start.wav</w:t>
+      </w:r>
+    </w:p>
+    <w:p>
+      <w:r>
+        <w:rPr>
+          <w:rFonts w:ascii="MS Gothic" w:eastAsia="MS Gothic" w:hAnsi="MS Gothic" w:cs="MS Gothic" w:hint="eastAsia"/>
+        </w:rPr>
+        <w:t>├</w:t>
+      </w:r>
+      <w:r>
+        <w:rPr>
+          <w:rFonts w:cs="Aptos"/>
+        </w:rPr>
+        <w:t>──</w:t>
+      </w:r>
+      <w:r>
+        <w:t xml:space="preserve"> sr_round_end.wav</w:t>
+      </w:r>
+    </w:p>
+    <w:p>
+      <w:r>
+        <w:rPr>
+          <w:rFonts w:ascii="MS Gothic" w:eastAsia="MS Gothic" w:hAnsi="MS Gothic" w:cs="MS Gothic" w:hint="eastAsia"/>
+        </w:rPr>
+        <w:t>├</w:t>
+      </w:r>
+      <w:r>
+        <w:rPr>
+          <w:rFonts w:cs="Aptos"/>
+        </w:rPr>
+        <w:t>──</w:t>
+      </w:r>
+      <w:r>
+        <w:t xml:space="preserve"> sr_win.wav</w:t>
+      </w:r>
+    </w:p>
+    <w:p>
+      <w:r>
+        <w:t>└── sr_lose.wav</w:t>
+      </w:r>
+    </w:p>
+    <w:p>
+      <w:pPr>
+        <w:rPr>
+          <w:b/>
+          <w:bCs/>
+        </w:rPr>
+      </w:pPr>
+      <w:r>
+        <w:rPr>
+          <w:b/>
+          <w:bCs/>
+        </w:rPr>
+        <w:t>Metrics to Track</w:t>
+      </w:r>
+    </w:p>
+    <w:p>
+      <w:pPr>
+        <w:numPr>
+          <w:ilvl w:val="0"/>
+          <w:numId w:val="12"/>
+        </w:numPr>
+      </w:pPr>
+      <w:r>
+        <w:t>Score</w:t>
+      </w:r>
+    </w:p>
+    <w:p>
+      <w:pPr>
+        <w:numPr>
+          <w:ilvl w:val="0"/>
+          <w:numId w:val="12"/>
+        </w:numPr>
+      </w:pPr>
+      <w:r>
+        <w:t>Accuracy (hits/shots)</w:t>
+      </w:r>
+    </w:p>
+    <w:p>
+      <w:pPr>
+        <w:numPr>
+          <w:ilvl w:val="0"/>
+          <w:numId w:val="12"/>
+        </w:numPr>
+      </w:pPr>
+      <w:r>
+        <w:t>Snakes destroyed (by type/color)</w:t>
+      </w:r>
+    </w:p>
+    <w:p>
+      <w:pPr>
+        <w:numPr>
+          <w:ilvl w:val="0"/>
+          <w:numId w:val="12"/>
+        </w:numPr>
+      </w:pPr>
+      <w:r>
+        <w:t>Eggs collected</w:t>
+      </w:r>
+    </w:p>
+    <w:p>
+      <w:pPr>
+        <w:numPr>
+          <w:ilvl w:val="0"/>
+          <w:numId w:val="12"/>
+        </w:numPr>
+      </w:pPr>
+      <w:r>
+        <w:t>Eggs hatched (allowed to hatch)</w:t>
+      </w:r>
+    </w:p>
+    <w:p>
+      <w:pPr>
+        <w:numPr>
+          <w:ilvl w:val="0"/>
+          <w:numId w:val="12"/>
+        </w:numPr>
+      </w:pPr>
+      <w:r>
+        <w:t>Baby snakes destroyed</w:t>
+      </w:r>
+    </w:p>
+    <w:p>
+      <w:pPr>
+        <w:numPr>
+          <w:ilvl w:val="0"/>
+          <w:numId w:val="12"/>
+        </w:numPr>
+      </w:pPr>
+      <w:r>
+        <w:t>Hunter Snakes destroyed</w:t>
+      </w:r>
+    </w:p>
+    <w:p>
+      <w:pPr>
+        <w:numPr>
+          <w:ilvl w:val="0"/>
+          <w:numId w:val="12"/>
+        </w:numPr>
+      </w:pPr>
+      <w:r>
+        <w:t>Lives remaining</w:t>
+      </w:r>
+    </w:p>
+    <w:p>
+      <w:pPr>
+        <w:numPr>
+          <w:ilvl w:val="0"/>
+          <w:numId w:val="12"/>
+        </w:numPr>
+      </w:pPr>
+      <w:r>
+        <w:t>Bullets fired</w:t>
+      </w:r>
+    </w:p>
+    <w:p>
+      <w:pPr>
+        <w:numPr>
+          <w:ilvl w:val="0"/>
+          <w:numId w:val="12"/>
+        </w:numPr>
+      </w:pPr>
+      <w:r>
+        <w:t>Wrong color shots</w:t>
+      </w:r>
+    </w:p>
+    <w:p>
+      <w:pPr>
+        <w:numPr>
+          <w:ilvl w:val="0"/>
+          <w:numId w:val="12"/>
+        </w:numPr>
+      </w:pPr>
+      <w:r>
+        <w:t>Blocked shots</w:t>
+      </w:r>
+    </w:p>
     <w:p/>
     <w:p>
       <w:pPr>
@@ -8762,6 +11575,453 @@
       </w:pPr>
       <w:rPr>
         <w:rFonts w:ascii="Symbol" w:hAnsi="Symbol" w:hint="default"/>
+      </w:rPr>
+    </w:lvl>
+  </w:abstractNum>
+  <w:abstractNum w:abstractNumId="9" w15:restartNumberingAfterBreak="0">
+    <w:nsid w:val="0F5679E6"/>
+    <w:multiLevelType w:val="multilevel"/>
+    <w:tmpl w:val="66BE0BD8"/>
+    <w:lvl w:ilvl="0">
+      <w:start w:val="1"/>
+      <w:numFmt w:val="bullet"/>
+      <w:lvlText w:val=""/>
+      <w:lvlJc w:val="left"/>
+      <w:pPr>
+        <w:tabs>
+          <w:tab w:val="num" w:pos="720"/>
+        </w:tabs>
+        <w:ind w:left="720" w:hanging="360"/>
+      </w:pPr>
+      <w:rPr>
+        <w:rFonts w:ascii="Symbol" w:hAnsi="Symbol" w:hint="default"/>
+        <w:sz w:val="20"/>
+      </w:rPr>
+    </w:lvl>
+    <w:lvl w:ilvl="1" w:tentative="1">
+      <w:start w:val="1"/>
+      <w:numFmt w:val="bullet"/>
+      <w:lvlText w:val="o"/>
+      <w:lvlJc w:val="left"/>
+      <w:pPr>
+        <w:tabs>
+          <w:tab w:val="num" w:pos="1440"/>
+        </w:tabs>
+        <w:ind w:left="1440" w:hanging="360"/>
+      </w:pPr>
+      <w:rPr>
+        <w:rFonts w:ascii="Courier New" w:hAnsi="Courier New" w:hint="default"/>
+        <w:sz w:val="20"/>
+      </w:rPr>
+    </w:lvl>
+    <w:lvl w:ilvl="2" w:tentative="1">
+      <w:start w:val="1"/>
+      <w:numFmt w:val="bullet"/>
+      <w:lvlText w:val=""/>
+      <w:lvlJc w:val="left"/>
+      <w:pPr>
+        <w:tabs>
+          <w:tab w:val="num" w:pos="2160"/>
+        </w:tabs>
+        <w:ind w:left="2160" w:hanging="360"/>
+      </w:pPr>
+      <w:rPr>
+        <w:rFonts w:ascii="Wingdings" w:hAnsi="Wingdings" w:hint="default"/>
+        <w:sz w:val="20"/>
+      </w:rPr>
+    </w:lvl>
+    <w:lvl w:ilvl="3" w:tentative="1">
+      <w:start w:val="1"/>
+      <w:numFmt w:val="bullet"/>
+      <w:lvlText w:val=""/>
+      <w:lvlJc w:val="left"/>
+      <w:pPr>
+        <w:tabs>
+          <w:tab w:val="num" w:pos="2880"/>
+        </w:tabs>
+        <w:ind w:left="2880" w:hanging="360"/>
+      </w:pPr>
+      <w:rPr>
+        <w:rFonts w:ascii="Wingdings" w:hAnsi="Wingdings" w:hint="default"/>
+        <w:sz w:val="20"/>
+      </w:rPr>
+    </w:lvl>
+    <w:lvl w:ilvl="4" w:tentative="1">
+      <w:start w:val="1"/>
+      <w:numFmt w:val="bullet"/>
+      <w:lvlText w:val=""/>
+      <w:lvlJc w:val="left"/>
+      <w:pPr>
+        <w:tabs>
+          <w:tab w:val="num" w:pos="3600"/>
+        </w:tabs>
+        <w:ind w:left="3600" w:hanging="360"/>
+      </w:pPr>
+      <w:rPr>
+        <w:rFonts w:ascii="Wingdings" w:hAnsi="Wingdings" w:hint="default"/>
+        <w:sz w:val="20"/>
+      </w:rPr>
+    </w:lvl>
+    <w:lvl w:ilvl="5" w:tentative="1">
+      <w:start w:val="1"/>
+      <w:numFmt w:val="bullet"/>
+      <w:lvlText w:val=""/>
+      <w:lvlJc w:val="left"/>
+      <w:pPr>
+        <w:tabs>
+          <w:tab w:val="num" w:pos="4320"/>
+        </w:tabs>
+        <w:ind w:left="4320" w:hanging="360"/>
+      </w:pPr>
+      <w:rPr>
+        <w:rFonts w:ascii="Wingdings" w:hAnsi="Wingdings" w:hint="default"/>
+        <w:sz w:val="20"/>
+      </w:rPr>
+    </w:lvl>
+    <w:lvl w:ilvl="6" w:tentative="1">
+      <w:start w:val="1"/>
+      <w:numFmt w:val="bullet"/>
+      <w:lvlText w:val=""/>
+      <w:lvlJc w:val="left"/>
+      <w:pPr>
+        <w:tabs>
+          <w:tab w:val="num" w:pos="5040"/>
+        </w:tabs>
+        <w:ind w:left="5040" w:hanging="360"/>
+      </w:pPr>
+      <w:rPr>
+        <w:rFonts w:ascii="Wingdings" w:hAnsi="Wingdings" w:hint="default"/>
+        <w:sz w:val="20"/>
+      </w:rPr>
+    </w:lvl>
+    <w:lvl w:ilvl="7" w:tentative="1">
+      <w:start w:val="1"/>
+      <w:numFmt w:val="bullet"/>
+      <w:lvlText w:val=""/>
+      <w:lvlJc w:val="left"/>
+      <w:pPr>
+        <w:tabs>
+          <w:tab w:val="num" w:pos="5760"/>
+        </w:tabs>
+        <w:ind w:left="5760" w:hanging="360"/>
+      </w:pPr>
+      <w:rPr>
+        <w:rFonts w:ascii="Wingdings" w:hAnsi="Wingdings" w:hint="default"/>
+        <w:sz w:val="20"/>
+      </w:rPr>
+    </w:lvl>
+    <w:lvl w:ilvl="8" w:tentative="1">
+      <w:start w:val="1"/>
+      <w:numFmt w:val="bullet"/>
+      <w:lvlText w:val=""/>
+      <w:lvlJc w:val="left"/>
+      <w:pPr>
+        <w:tabs>
+          <w:tab w:val="num" w:pos="6480"/>
+        </w:tabs>
+        <w:ind w:left="6480" w:hanging="360"/>
+      </w:pPr>
+      <w:rPr>
+        <w:rFonts w:ascii="Wingdings" w:hAnsi="Wingdings" w:hint="default"/>
+        <w:sz w:val="20"/>
+      </w:rPr>
+    </w:lvl>
+  </w:abstractNum>
+  <w:abstractNum w:abstractNumId="10" w15:restartNumberingAfterBreak="0">
+    <w:nsid w:val="372952DA"/>
+    <w:multiLevelType w:val="multilevel"/>
+    <w:tmpl w:val="8D020EB6"/>
+    <w:lvl w:ilvl="0">
+      <w:start w:val="1"/>
+      <w:numFmt w:val="bullet"/>
+      <w:lvlText w:val=""/>
+      <w:lvlJc w:val="left"/>
+      <w:pPr>
+        <w:tabs>
+          <w:tab w:val="num" w:pos="720"/>
+        </w:tabs>
+        <w:ind w:left="720" w:hanging="360"/>
+      </w:pPr>
+      <w:rPr>
+        <w:rFonts w:ascii="Symbol" w:hAnsi="Symbol" w:hint="default"/>
+        <w:sz w:val="20"/>
+      </w:rPr>
+    </w:lvl>
+    <w:lvl w:ilvl="1" w:tentative="1">
+      <w:start w:val="1"/>
+      <w:numFmt w:val="bullet"/>
+      <w:lvlText w:val="o"/>
+      <w:lvlJc w:val="left"/>
+      <w:pPr>
+        <w:tabs>
+          <w:tab w:val="num" w:pos="1440"/>
+        </w:tabs>
+        <w:ind w:left="1440" w:hanging="360"/>
+      </w:pPr>
+      <w:rPr>
+        <w:rFonts w:ascii="Courier New" w:hAnsi="Courier New" w:hint="default"/>
+        <w:sz w:val="20"/>
+      </w:rPr>
+    </w:lvl>
+    <w:lvl w:ilvl="2" w:tentative="1">
+      <w:start w:val="1"/>
+      <w:numFmt w:val="bullet"/>
+      <w:lvlText w:val=""/>
+      <w:lvlJc w:val="left"/>
+      <w:pPr>
+        <w:tabs>
+          <w:tab w:val="num" w:pos="2160"/>
+        </w:tabs>
+        <w:ind w:left="2160" w:hanging="360"/>
+      </w:pPr>
+      <w:rPr>
+        <w:rFonts w:ascii="Wingdings" w:hAnsi="Wingdings" w:hint="default"/>
+        <w:sz w:val="20"/>
+      </w:rPr>
+    </w:lvl>
+    <w:lvl w:ilvl="3" w:tentative="1">
+      <w:start w:val="1"/>
+      <w:numFmt w:val="bullet"/>
+      <w:lvlText w:val=""/>
+      <w:lvlJc w:val="left"/>
+      <w:pPr>
+        <w:tabs>
+          <w:tab w:val="num" w:pos="2880"/>
+        </w:tabs>
+        <w:ind w:left="2880" w:hanging="360"/>
+      </w:pPr>
+      <w:rPr>
+        <w:rFonts w:ascii="Wingdings" w:hAnsi="Wingdings" w:hint="default"/>
+        <w:sz w:val="20"/>
+      </w:rPr>
+    </w:lvl>
+    <w:lvl w:ilvl="4" w:tentative="1">
+      <w:start w:val="1"/>
+      <w:numFmt w:val="bullet"/>
+      <w:lvlText w:val=""/>
+      <w:lvlJc w:val="left"/>
+      <w:pPr>
+        <w:tabs>
+          <w:tab w:val="num" w:pos="3600"/>
+        </w:tabs>
+        <w:ind w:left="3600" w:hanging="360"/>
+      </w:pPr>
+      <w:rPr>
+        <w:rFonts w:ascii="Wingdings" w:hAnsi="Wingdings" w:hint="default"/>
+        <w:sz w:val="20"/>
+      </w:rPr>
+    </w:lvl>
+    <w:lvl w:ilvl="5" w:tentative="1">
+      <w:start w:val="1"/>
+      <w:numFmt w:val="bullet"/>
+      <w:lvlText w:val=""/>
+      <w:lvlJc w:val="left"/>
+      <w:pPr>
+        <w:tabs>
+          <w:tab w:val="num" w:pos="4320"/>
+        </w:tabs>
+        <w:ind w:left="4320" w:hanging="360"/>
+      </w:pPr>
+      <w:rPr>
+        <w:rFonts w:ascii="Wingdings" w:hAnsi="Wingdings" w:hint="default"/>
+        <w:sz w:val="20"/>
+      </w:rPr>
+    </w:lvl>
+    <w:lvl w:ilvl="6" w:tentative="1">
+      <w:start w:val="1"/>
+      <w:numFmt w:val="bullet"/>
+      <w:lvlText w:val=""/>
+      <w:lvlJc w:val="left"/>
+      <w:pPr>
+        <w:tabs>
+          <w:tab w:val="num" w:pos="5040"/>
+        </w:tabs>
+        <w:ind w:left="5040" w:hanging="360"/>
+      </w:pPr>
+      <w:rPr>
+        <w:rFonts w:ascii="Wingdings" w:hAnsi="Wingdings" w:hint="default"/>
+        <w:sz w:val="20"/>
+      </w:rPr>
+    </w:lvl>
+    <w:lvl w:ilvl="7" w:tentative="1">
+      <w:start w:val="1"/>
+      <w:numFmt w:val="bullet"/>
+      <w:lvlText w:val=""/>
+      <w:lvlJc w:val="left"/>
+      <w:pPr>
+        <w:tabs>
+          <w:tab w:val="num" w:pos="5760"/>
+        </w:tabs>
+        <w:ind w:left="5760" w:hanging="360"/>
+      </w:pPr>
+      <w:rPr>
+        <w:rFonts w:ascii="Wingdings" w:hAnsi="Wingdings" w:hint="default"/>
+        <w:sz w:val="20"/>
+      </w:rPr>
+    </w:lvl>
+    <w:lvl w:ilvl="8" w:tentative="1">
+      <w:start w:val="1"/>
+      <w:numFmt w:val="bullet"/>
+      <w:lvlText w:val=""/>
+      <w:lvlJc w:val="left"/>
+      <w:pPr>
+        <w:tabs>
+          <w:tab w:val="num" w:pos="6480"/>
+        </w:tabs>
+        <w:ind w:left="6480" w:hanging="360"/>
+      </w:pPr>
+      <w:rPr>
+        <w:rFonts w:ascii="Wingdings" w:hAnsi="Wingdings" w:hint="default"/>
+        <w:sz w:val="20"/>
+      </w:rPr>
+    </w:lvl>
+  </w:abstractNum>
+  <w:abstractNum w:abstractNumId="11" w15:restartNumberingAfterBreak="0">
+    <w:nsid w:val="49795E07"/>
+    <w:multiLevelType w:val="multilevel"/>
+    <w:tmpl w:val="E63C3D6C"/>
+    <w:lvl w:ilvl="0">
+      <w:start w:val="1"/>
+      <w:numFmt w:val="bullet"/>
+      <w:lvlText w:val=""/>
+      <w:lvlJc w:val="left"/>
+      <w:pPr>
+        <w:tabs>
+          <w:tab w:val="num" w:pos="720"/>
+        </w:tabs>
+        <w:ind w:left="720" w:hanging="360"/>
+      </w:pPr>
+      <w:rPr>
+        <w:rFonts w:ascii="Symbol" w:hAnsi="Symbol" w:hint="default"/>
+        <w:sz w:val="20"/>
+      </w:rPr>
+    </w:lvl>
+    <w:lvl w:ilvl="1" w:tentative="1">
+      <w:start w:val="1"/>
+      <w:numFmt w:val="bullet"/>
+      <w:lvlText w:val="o"/>
+      <w:lvlJc w:val="left"/>
+      <w:pPr>
+        <w:tabs>
+          <w:tab w:val="num" w:pos="1440"/>
+        </w:tabs>
+        <w:ind w:left="1440" w:hanging="360"/>
+      </w:pPr>
+      <w:rPr>
+        <w:rFonts w:ascii="Courier New" w:hAnsi="Courier New" w:hint="default"/>
+        <w:sz w:val="20"/>
+      </w:rPr>
+    </w:lvl>
+    <w:lvl w:ilvl="2" w:tentative="1">
+      <w:start w:val="1"/>
+      <w:numFmt w:val="bullet"/>
+      <w:lvlText w:val=""/>
+      <w:lvlJc w:val="left"/>
+      <w:pPr>
+        <w:tabs>
+          <w:tab w:val="num" w:pos="2160"/>
+        </w:tabs>
+        <w:ind w:left="2160" w:hanging="360"/>
+      </w:pPr>
+      <w:rPr>
+        <w:rFonts w:ascii="Wingdings" w:hAnsi="Wingdings" w:hint="default"/>
+        <w:sz w:val="20"/>
+      </w:rPr>
+    </w:lvl>
+    <w:lvl w:ilvl="3" w:tentative="1">
+      <w:start w:val="1"/>
+      <w:numFmt w:val="bullet"/>
+      <w:lvlText w:val=""/>
+      <w:lvlJc w:val="left"/>
+      <w:pPr>
+        <w:tabs>
+          <w:tab w:val="num" w:pos="2880"/>
+        </w:tabs>
+        <w:ind w:left="2880" w:hanging="360"/>
+      </w:pPr>
+      <w:rPr>
+        <w:rFonts w:ascii="Wingdings" w:hAnsi="Wingdings" w:hint="default"/>
+        <w:sz w:val="20"/>
+      </w:rPr>
+    </w:lvl>
+    <w:lvl w:ilvl="4" w:tentative="1">
+      <w:start w:val="1"/>
+      <w:numFmt w:val="bullet"/>
+      <w:lvlText w:val=""/>
+      <w:lvlJc w:val="left"/>
+      <w:pPr>
+        <w:tabs>
+          <w:tab w:val="num" w:pos="3600"/>
+        </w:tabs>
+        <w:ind w:left="3600" w:hanging="360"/>
+      </w:pPr>
+      <w:rPr>
+        <w:rFonts w:ascii="Wingdings" w:hAnsi="Wingdings" w:hint="default"/>
+        <w:sz w:val="20"/>
+      </w:rPr>
+    </w:lvl>
+    <w:lvl w:ilvl="5" w:tentative="1">
+      <w:start w:val="1"/>
+      <w:numFmt w:val="bullet"/>
+      <w:lvlText w:val=""/>
+      <w:lvlJc w:val="left"/>
+      <w:pPr>
+        <w:tabs>
+          <w:tab w:val="num" w:pos="4320"/>
+        </w:tabs>
+        <w:ind w:left="4320" w:hanging="360"/>
+      </w:pPr>
+      <w:rPr>
+        <w:rFonts w:ascii="Wingdings" w:hAnsi="Wingdings" w:hint="default"/>
+        <w:sz w:val="20"/>
+      </w:rPr>
+    </w:lvl>
+    <w:lvl w:ilvl="6" w:tentative="1">
+      <w:start w:val="1"/>
+      <w:numFmt w:val="bullet"/>
+      <w:lvlText w:val=""/>
+      <w:lvlJc w:val="left"/>
+      <w:pPr>
+        <w:tabs>
+          <w:tab w:val="num" w:pos="5040"/>
+        </w:tabs>
+        <w:ind w:left="5040" w:hanging="360"/>
+      </w:pPr>
+      <w:rPr>
+        <w:rFonts w:ascii="Wingdings" w:hAnsi="Wingdings" w:hint="default"/>
+        <w:sz w:val="20"/>
+      </w:rPr>
+    </w:lvl>
+    <w:lvl w:ilvl="7" w:tentative="1">
+      <w:start w:val="1"/>
+      <w:numFmt w:val="bullet"/>
+      <w:lvlText w:val=""/>
+      <w:lvlJc w:val="left"/>
+      <w:pPr>
+        <w:tabs>
+          <w:tab w:val="num" w:pos="5760"/>
+        </w:tabs>
+        <w:ind w:left="5760" w:hanging="360"/>
+      </w:pPr>
+      <w:rPr>
+        <w:rFonts w:ascii="Wingdings" w:hAnsi="Wingdings" w:hint="default"/>
+        <w:sz w:val="20"/>
+      </w:rPr>
+    </w:lvl>
+    <w:lvl w:ilvl="8" w:tentative="1">
+      <w:start w:val="1"/>
+      <w:numFmt w:val="bullet"/>
+      <w:lvlText w:val=""/>
+      <w:lvlJc w:val="left"/>
+      <w:pPr>
+        <w:tabs>
+          <w:tab w:val="num" w:pos="6480"/>
+        </w:tabs>
+        <w:ind w:left="6480" w:hanging="360"/>
+      </w:pPr>
+      <w:rPr>
+        <w:rFonts w:ascii="Wingdings" w:hAnsi="Wingdings" w:hint="default"/>
+        <w:sz w:val="20"/>
       </w:rPr>
     </w:lvl>
   </w:abstractNum>
@@ -8791,6 +12051,15 @@
   </w:num>
   <w:num w:numId="9" w16cid:durableId="1016536367">
     <w:abstractNumId w:val="0"/>
+  </w:num>
+  <w:num w:numId="10" w16cid:durableId="1344429617">
+    <w:abstractNumId w:val="9"/>
+  </w:num>
+  <w:num w:numId="11" w16cid:durableId="1418593261">
+    <w:abstractNumId w:val="10"/>
+  </w:num>
+  <w:num w:numId="12" w16cid:durableId="1707563212">
+    <w:abstractNumId w:val="11"/>
   </w:num>
 </w:numbering>
 </file>
@@ -9406,7 +12675,6 @@
   <w:style w:type="character" w:default="1" w:styleId="DefaultParagraphFont">
     <w:name w:val="Default Paragraph Font"/>
     <w:uiPriority w:val="1"/>
-    <w:semiHidden/>
     <w:unhideWhenUsed/>
   </w:style>
   <w:style w:type="table" w:default="1" w:styleId="TableNormal">

</xml_diff>

<commit_message>
v22.6.0 - added music to part of the console. wip. add wav placeholders in /acces/audio/surround.
</commit_message>
<xml_diff>
--- a/Surround_Game_Design_Specification.docx
+++ b/Surround_Game_Design_Specification.docx
@@ -11388,6 +11388,1270 @@
         <w:t>Blocked shots</w:t>
       </w:r>
     </w:p>
+    <w:p/>
+    <w:p/>
+    <w:p/>
+    <w:p/>
+    <w:p/>
+    <w:p/>
+    <w:p/>
+    <w:p/>
+    <w:p/>
+    <w:p>
+      <w:pPr>
+        <w:jc w:val="center"/>
+        <w:rPr>
+          <w:sz w:val="40"/>
+          <w:szCs w:val="40"/>
+        </w:rPr>
+      </w:pPr>
+      <w:r>
+        <w:rPr>
+          <w:sz w:val="40"/>
+          <w:szCs w:val="40"/>
+        </w:rPr>
+        <w:t>Sound &amp; Music</w:t>
+      </w:r>
+    </w:p>
+    <w:p>
+      <w:pPr>
+        <w:jc w:val="center"/>
+        <w:rPr>
+          <w:sz w:val="40"/>
+          <w:szCs w:val="40"/>
+        </w:rPr>
+      </w:pPr>
+    </w:p>
+    <w:p>
+      <w:pPr>
+        <w:jc w:val="center"/>
+        <w:rPr>
+          <w:sz w:val="40"/>
+          <w:szCs w:val="40"/>
+        </w:rPr>
+      </w:pPr>
+    </w:p>
+    <w:p>
+      <w:pPr>
+        <w:rPr>
+          <w:b/>
+          <w:bCs/>
+        </w:rPr>
+      </w:pPr>
+      <w:r>
+        <w:rPr>
+          <w:b/>
+          <w:bCs/>
+        </w:rPr>
+        <w:t>Summary of Sound Files in /assets/audio/surround/</w:t>
+      </w:r>
+    </w:p>
+    <w:tbl>
+      <w:tblPr>
+        <w:tblW w:w="0" w:type="auto"/>
+        <w:shd w:val="clear" w:color="auto" w:fill="0D1117"/>
+        <w:tblCellMar>
+          <w:top w:w="15" w:type="dxa"/>
+          <w:left w:w="15" w:type="dxa"/>
+          <w:bottom w:w="15" w:type="dxa"/>
+          <w:right w:w="15" w:type="dxa"/>
+        </w:tblCellMar>
+        <w:tblLook w:val="04A0" w:firstRow="1" w:lastRow="0" w:firstColumn="1" w:lastColumn="0" w:noHBand="0" w:noVBand="1"/>
+      </w:tblPr>
+      <w:tblGrid>
+        <w:gridCol w:w="2533"/>
+        <w:gridCol w:w="3194"/>
+        <w:gridCol w:w="3620"/>
+      </w:tblGrid>
+      <w:tr>
+        <w:trPr>
+          <w:tblHeader/>
+        </w:trPr>
+        <w:tc>
+          <w:tcPr>
+            <w:tcW w:w="0" w:type="auto"/>
+            <w:tcBorders>
+              <w:top w:val="single" w:sz="4" w:space="0" w:color="3D444D"/>
+              <w:left w:val="single" w:sz="4" w:space="0" w:color="3D444D"/>
+              <w:bottom w:val="single" w:sz="4" w:space="0" w:color="3D444D"/>
+              <w:right w:val="single" w:sz="4" w:space="0" w:color="3D444D"/>
+            </w:tcBorders>
+            <w:shd w:val="clear" w:color="auto" w:fill="0D1117"/>
+            <w:tcMar>
+              <w:top w:w="90" w:type="dxa"/>
+              <w:left w:w="195" w:type="dxa"/>
+              <w:bottom w:w="90" w:type="dxa"/>
+              <w:right w:w="195" w:type="dxa"/>
+            </w:tcMar>
+            <w:vAlign w:val="center"/>
+            <w:hideMark/>
+          </w:tcPr>
+          <w:p>
+            <w:pPr>
+              <w:rPr>
+                <w:b/>
+                <w:bCs/>
+              </w:rPr>
+            </w:pPr>
+            <w:r>
+              <w:rPr>
+                <w:b/>
+                <w:bCs/>
+              </w:rPr>
+              <w:t>Sound Key</w:t>
+            </w:r>
+          </w:p>
+        </w:tc>
+        <w:tc>
+          <w:tcPr>
+            <w:tcW w:w="0" w:type="auto"/>
+            <w:tcBorders>
+              <w:top w:val="single" w:sz="4" w:space="0" w:color="3D444D"/>
+              <w:left w:val="single" w:sz="4" w:space="0" w:color="3D444D"/>
+              <w:bottom w:val="single" w:sz="4" w:space="0" w:color="3D444D"/>
+              <w:right w:val="single" w:sz="4" w:space="0" w:color="3D444D"/>
+            </w:tcBorders>
+            <w:shd w:val="clear" w:color="auto" w:fill="0D1117"/>
+            <w:tcMar>
+              <w:top w:w="90" w:type="dxa"/>
+              <w:left w:w="195" w:type="dxa"/>
+              <w:bottom w:w="90" w:type="dxa"/>
+              <w:right w:w="195" w:type="dxa"/>
+            </w:tcMar>
+            <w:vAlign w:val="center"/>
+            <w:hideMark/>
+          </w:tcPr>
+          <w:p>
+            <w:pPr>
+              <w:rPr>
+                <w:b/>
+                <w:bCs/>
+              </w:rPr>
+            </w:pPr>
+            <w:r>
+              <w:rPr>
+                <w:b/>
+                <w:bCs/>
+              </w:rPr>
+              <w:t>File</w:t>
+            </w:r>
+          </w:p>
+        </w:tc>
+        <w:tc>
+          <w:tcPr>
+            <w:tcW w:w="0" w:type="auto"/>
+            <w:tcBorders>
+              <w:top w:val="single" w:sz="4" w:space="0" w:color="3D444D"/>
+              <w:left w:val="single" w:sz="4" w:space="0" w:color="3D444D"/>
+              <w:bottom w:val="single" w:sz="4" w:space="0" w:color="3D444D"/>
+              <w:right w:val="single" w:sz="4" w:space="0" w:color="3D444D"/>
+            </w:tcBorders>
+            <w:shd w:val="clear" w:color="auto" w:fill="0D1117"/>
+            <w:tcMar>
+              <w:top w:w="90" w:type="dxa"/>
+              <w:left w:w="195" w:type="dxa"/>
+              <w:bottom w:w="90" w:type="dxa"/>
+              <w:right w:w="195" w:type="dxa"/>
+            </w:tcMar>
+            <w:vAlign w:val="center"/>
+            <w:hideMark/>
+          </w:tcPr>
+          <w:p>
+            <w:pPr>
+              <w:rPr>
+                <w:b/>
+                <w:bCs/>
+              </w:rPr>
+            </w:pPr>
+            <w:r>
+              <w:rPr>
+                <w:b/>
+                <w:bCs/>
+              </w:rPr>
+              <w:t>When to Play</w:t>
+            </w:r>
+          </w:p>
+        </w:tc>
+      </w:tr>
+      <w:tr>
+        <w:tc>
+          <w:tcPr>
+            <w:tcW w:w="0" w:type="auto"/>
+            <w:tcBorders>
+              <w:top w:val="single" w:sz="4" w:space="0" w:color="3D444D"/>
+              <w:left w:val="single" w:sz="4" w:space="0" w:color="3D444D"/>
+              <w:bottom w:val="single" w:sz="4" w:space="0" w:color="3D444D"/>
+              <w:right w:val="single" w:sz="4" w:space="0" w:color="3D444D"/>
+            </w:tcBorders>
+            <w:shd w:val="clear" w:color="auto" w:fill="0D1117"/>
+            <w:tcMar>
+              <w:top w:w="90" w:type="dxa"/>
+              <w:left w:w="195" w:type="dxa"/>
+              <w:bottom w:w="90" w:type="dxa"/>
+              <w:right w:w="195" w:type="dxa"/>
+            </w:tcMar>
+            <w:vAlign w:val="center"/>
+            <w:hideMark/>
+          </w:tcPr>
+          <w:p>
+            <w:proofErr w:type="spellStart"/>
+            <w:r>
+              <w:t>su_shot_fire</w:t>
+            </w:r>
+            <w:proofErr w:type="spellEnd"/>
+          </w:p>
+        </w:tc>
+        <w:tc>
+          <w:tcPr>
+            <w:tcW w:w="0" w:type="auto"/>
+            <w:tcBorders>
+              <w:top w:val="single" w:sz="4" w:space="0" w:color="3D444D"/>
+              <w:left w:val="single" w:sz="4" w:space="0" w:color="3D444D"/>
+              <w:bottom w:val="single" w:sz="4" w:space="0" w:color="3D444D"/>
+              <w:right w:val="single" w:sz="4" w:space="0" w:color="3D444D"/>
+            </w:tcBorders>
+            <w:shd w:val="clear" w:color="auto" w:fill="0D1117"/>
+            <w:tcMar>
+              <w:top w:w="90" w:type="dxa"/>
+              <w:left w:w="195" w:type="dxa"/>
+              <w:bottom w:w="90" w:type="dxa"/>
+              <w:right w:w="195" w:type="dxa"/>
+            </w:tcMar>
+            <w:vAlign w:val="center"/>
+            <w:hideMark/>
+          </w:tcPr>
+          <w:p>
+            <w:r>
+              <w:t>su_shot_fire.wav </w:t>
+            </w:r>
+            <w:r>
+              <w:rPr>
+                <w:rFonts w:ascii="Segoe UI Emoji" w:hAnsi="Segoe UI Emoji" w:cs="Segoe UI Emoji"/>
+              </w:rPr>
+              <w:t>✅</w:t>
+            </w:r>
+            <w:r>
+              <w:t xml:space="preserve"> (has data)</w:t>
+            </w:r>
+          </w:p>
+        </w:tc>
+        <w:tc>
+          <w:tcPr>
+            <w:tcW w:w="0" w:type="auto"/>
+            <w:tcBorders>
+              <w:top w:val="single" w:sz="4" w:space="0" w:color="3D444D"/>
+              <w:left w:val="single" w:sz="4" w:space="0" w:color="3D444D"/>
+              <w:bottom w:val="single" w:sz="4" w:space="0" w:color="3D444D"/>
+              <w:right w:val="single" w:sz="4" w:space="0" w:color="3D444D"/>
+            </w:tcBorders>
+            <w:shd w:val="clear" w:color="auto" w:fill="0D1117"/>
+            <w:tcMar>
+              <w:top w:w="90" w:type="dxa"/>
+              <w:left w:w="195" w:type="dxa"/>
+              <w:bottom w:w="90" w:type="dxa"/>
+              <w:right w:w="195" w:type="dxa"/>
+            </w:tcMar>
+            <w:vAlign w:val="center"/>
+            <w:hideMark/>
+          </w:tcPr>
+          <w:p>
+            <w:r>
+              <w:t>Player fires projectile</w:t>
+            </w:r>
+          </w:p>
+        </w:tc>
+      </w:tr>
+      <w:tr>
+        <w:tc>
+          <w:tcPr>
+            <w:tcW w:w="0" w:type="auto"/>
+            <w:tcBorders>
+              <w:top w:val="single" w:sz="4" w:space="0" w:color="3D444D"/>
+              <w:left w:val="single" w:sz="4" w:space="0" w:color="3D444D"/>
+              <w:bottom w:val="single" w:sz="4" w:space="0" w:color="3D444D"/>
+              <w:right w:val="single" w:sz="4" w:space="0" w:color="3D444D"/>
+            </w:tcBorders>
+            <w:shd w:val="clear" w:color="auto" w:fill="151B23"/>
+            <w:tcMar>
+              <w:top w:w="90" w:type="dxa"/>
+              <w:left w:w="195" w:type="dxa"/>
+              <w:bottom w:w="90" w:type="dxa"/>
+              <w:right w:w="195" w:type="dxa"/>
+            </w:tcMar>
+            <w:vAlign w:val="center"/>
+            <w:hideMark/>
+          </w:tcPr>
+          <w:p>
+            <w:proofErr w:type="spellStart"/>
+            <w:r>
+              <w:t>su_shot_hit_correct</w:t>
+            </w:r>
+            <w:proofErr w:type="spellEnd"/>
+          </w:p>
+        </w:tc>
+        <w:tc>
+          <w:tcPr>
+            <w:tcW w:w="0" w:type="auto"/>
+            <w:tcBorders>
+              <w:top w:val="single" w:sz="4" w:space="0" w:color="3D444D"/>
+              <w:left w:val="single" w:sz="4" w:space="0" w:color="3D444D"/>
+              <w:bottom w:val="single" w:sz="4" w:space="0" w:color="3D444D"/>
+              <w:right w:val="single" w:sz="4" w:space="0" w:color="3D444D"/>
+            </w:tcBorders>
+            <w:shd w:val="clear" w:color="auto" w:fill="151B23"/>
+            <w:tcMar>
+              <w:top w:w="90" w:type="dxa"/>
+              <w:left w:w="195" w:type="dxa"/>
+              <w:bottom w:w="90" w:type="dxa"/>
+              <w:right w:w="195" w:type="dxa"/>
+            </w:tcMar>
+            <w:vAlign w:val="center"/>
+            <w:hideMark/>
+          </w:tcPr>
+          <w:p>
+            <w:r>
+              <w:t>su_shot_hit_correct.wav</w:t>
+            </w:r>
+          </w:p>
+        </w:tc>
+        <w:tc>
+          <w:tcPr>
+            <w:tcW w:w="0" w:type="auto"/>
+            <w:tcBorders>
+              <w:top w:val="single" w:sz="4" w:space="0" w:color="3D444D"/>
+              <w:left w:val="single" w:sz="4" w:space="0" w:color="3D444D"/>
+              <w:bottom w:val="single" w:sz="4" w:space="0" w:color="3D444D"/>
+              <w:right w:val="single" w:sz="4" w:space="0" w:color="3D444D"/>
+            </w:tcBorders>
+            <w:shd w:val="clear" w:color="auto" w:fill="151B23"/>
+            <w:tcMar>
+              <w:top w:w="90" w:type="dxa"/>
+              <w:left w:w="195" w:type="dxa"/>
+              <w:bottom w:w="90" w:type="dxa"/>
+              <w:right w:w="195" w:type="dxa"/>
+            </w:tcMar>
+            <w:vAlign w:val="center"/>
+            <w:hideMark/>
+          </w:tcPr>
+          <w:p>
+            <w:r>
+              <w:t>Projectile hits matching color snake</w:t>
+            </w:r>
+          </w:p>
+        </w:tc>
+      </w:tr>
+      <w:tr>
+        <w:tc>
+          <w:tcPr>
+            <w:tcW w:w="0" w:type="auto"/>
+            <w:tcBorders>
+              <w:top w:val="single" w:sz="4" w:space="0" w:color="3D444D"/>
+              <w:left w:val="single" w:sz="4" w:space="0" w:color="3D444D"/>
+              <w:bottom w:val="single" w:sz="4" w:space="0" w:color="3D444D"/>
+              <w:right w:val="single" w:sz="4" w:space="0" w:color="3D444D"/>
+            </w:tcBorders>
+            <w:shd w:val="clear" w:color="auto" w:fill="0D1117"/>
+            <w:tcMar>
+              <w:top w:w="90" w:type="dxa"/>
+              <w:left w:w="195" w:type="dxa"/>
+              <w:bottom w:w="90" w:type="dxa"/>
+              <w:right w:w="195" w:type="dxa"/>
+            </w:tcMar>
+            <w:vAlign w:val="center"/>
+            <w:hideMark/>
+          </w:tcPr>
+          <w:p>
+            <w:proofErr w:type="spellStart"/>
+            <w:r>
+              <w:t>su_shot_hit_wrong</w:t>
+            </w:r>
+            <w:proofErr w:type="spellEnd"/>
+          </w:p>
+        </w:tc>
+        <w:tc>
+          <w:tcPr>
+            <w:tcW w:w="0" w:type="auto"/>
+            <w:tcBorders>
+              <w:top w:val="single" w:sz="4" w:space="0" w:color="3D444D"/>
+              <w:left w:val="single" w:sz="4" w:space="0" w:color="3D444D"/>
+              <w:bottom w:val="single" w:sz="4" w:space="0" w:color="3D444D"/>
+              <w:right w:val="single" w:sz="4" w:space="0" w:color="3D444D"/>
+            </w:tcBorders>
+            <w:shd w:val="clear" w:color="auto" w:fill="0D1117"/>
+            <w:tcMar>
+              <w:top w:w="90" w:type="dxa"/>
+              <w:left w:w="195" w:type="dxa"/>
+              <w:bottom w:w="90" w:type="dxa"/>
+              <w:right w:w="195" w:type="dxa"/>
+            </w:tcMar>
+            <w:vAlign w:val="center"/>
+            <w:hideMark/>
+          </w:tcPr>
+          <w:p>
+            <w:r>
+              <w:t>su_shot_hit_wrong.wav</w:t>
+            </w:r>
+          </w:p>
+        </w:tc>
+        <w:tc>
+          <w:tcPr>
+            <w:tcW w:w="0" w:type="auto"/>
+            <w:tcBorders>
+              <w:top w:val="single" w:sz="4" w:space="0" w:color="3D444D"/>
+              <w:left w:val="single" w:sz="4" w:space="0" w:color="3D444D"/>
+              <w:bottom w:val="single" w:sz="4" w:space="0" w:color="3D444D"/>
+              <w:right w:val="single" w:sz="4" w:space="0" w:color="3D444D"/>
+            </w:tcBorders>
+            <w:shd w:val="clear" w:color="auto" w:fill="0D1117"/>
+            <w:tcMar>
+              <w:top w:w="90" w:type="dxa"/>
+              <w:left w:w="195" w:type="dxa"/>
+              <w:bottom w:w="90" w:type="dxa"/>
+              <w:right w:w="195" w:type="dxa"/>
+            </w:tcMar>
+            <w:vAlign w:val="center"/>
+            <w:hideMark/>
+          </w:tcPr>
+          <w:p>
+            <w:r>
+              <w:t>Projectile hits wrong color snake</w:t>
+            </w:r>
+          </w:p>
+        </w:tc>
+      </w:tr>
+      <w:tr>
+        <w:tc>
+          <w:tcPr>
+            <w:tcW w:w="0" w:type="auto"/>
+            <w:tcBorders>
+              <w:top w:val="single" w:sz="4" w:space="0" w:color="3D444D"/>
+              <w:left w:val="single" w:sz="4" w:space="0" w:color="3D444D"/>
+              <w:bottom w:val="single" w:sz="4" w:space="0" w:color="3D444D"/>
+              <w:right w:val="single" w:sz="4" w:space="0" w:color="3D444D"/>
+            </w:tcBorders>
+            <w:shd w:val="clear" w:color="auto" w:fill="151B23"/>
+            <w:tcMar>
+              <w:top w:w="90" w:type="dxa"/>
+              <w:left w:w="195" w:type="dxa"/>
+              <w:bottom w:w="90" w:type="dxa"/>
+              <w:right w:w="195" w:type="dxa"/>
+            </w:tcMar>
+            <w:vAlign w:val="center"/>
+            <w:hideMark/>
+          </w:tcPr>
+          <w:p>
+            <w:proofErr w:type="spellStart"/>
+            <w:r>
+              <w:t>su_lane_switch</w:t>
+            </w:r>
+            <w:proofErr w:type="spellEnd"/>
+          </w:p>
+        </w:tc>
+        <w:tc>
+          <w:tcPr>
+            <w:tcW w:w="0" w:type="auto"/>
+            <w:tcBorders>
+              <w:top w:val="single" w:sz="4" w:space="0" w:color="3D444D"/>
+              <w:left w:val="single" w:sz="4" w:space="0" w:color="3D444D"/>
+              <w:bottom w:val="single" w:sz="4" w:space="0" w:color="3D444D"/>
+              <w:right w:val="single" w:sz="4" w:space="0" w:color="3D444D"/>
+            </w:tcBorders>
+            <w:shd w:val="clear" w:color="auto" w:fill="151B23"/>
+            <w:tcMar>
+              <w:top w:w="90" w:type="dxa"/>
+              <w:left w:w="195" w:type="dxa"/>
+              <w:bottom w:w="90" w:type="dxa"/>
+              <w:right w:w="195" w:type="dxa"/>
+            </w:tcMar>
+            <w:vAlign w:val="center"/>
+            <w:hideMark/>
+          </w:tcPr>
+          <w:p>
+            <w:r>
+              <w:t>su_lane_switch.wav</w:t>
+            </w:r>
+          </w:p>
+        </w:tc>
+        <w:tc>
+          <w:tcPr>
+            <w:tcW w:w="0" w:type="auto"/>
+            <w:tcBorders>
+              <w:top w:val="single" w:sz="4" w:space="0" w:color="3D444D"/>
+              <w:left w:val="single" w:sz="4" w:space="0" w:color="3D444D"/>
+              <w:bottom w:val="single" w:sz="4" w:space="0" w:color="3D444D"/>
+              <w:right w:val="single" w:sz="4" w:space="0" w:color="3D444D"/>
+            </w:tcBorders>
+            <w:shd w:val="clear" w:color="auto" w:fill="151B23"/>
+            <w:tcMar>
+              <w:top w:w="90" w:type="dxa"/>
+              <w:left w:w="195" w:type="dxa"/>
+              <w:bottom w:w="90" w:type="dxa"/>
+              <w:right w:w="195" w:type="dxa"/>
+            </w:tcMar>
+            <w:vAlign w:val="center"/>
+            <w:hideMark/>
+          </w:tcPr>
+          <w:p>
+            <w:r>
+              <w:t>Player switches lanes</w:t>
+            </w:r>
+          </w:p>
+        </w:tc>
+      </w:tr>
+      <w:tr>
+        <w:tc>
+          <w:tcPr>
+            <w:tcW w:w="0" w:type="auto"/>
+            <w:tcBorders>
+              <w:top w:val="single" w:sz="4" w:space="0" w:color="3D444D"/>
+              <w:left w:val="single" w:sz="4" w:space="0" w:color="3D444D"/>
+              <w:bottom w:val="single" w:sz="4" w:space="0" w:color="3D444D"/>
+              <w:right w:val="single" w:sz="4" w:space="0" w:color="3D444D"/>
+            </w:tcBorders>
+            <w:shd w:val="clear" w:color="auto" w:fill="0D1117"/>
+            <w:tcMar>
+              <w:top w:w="90" w:type="dxa"/>
+              <w:left w:w="195" w:type="dxa"/>
+              <w:bottom w:w="90" w:type="dxa"/>
+              <w:right w:w="195" w:type="dxa"/>
+            </w:tcMar>
+            <w:vAlign w:val="center"/>
+            <w:hideMark/>
+          </w:tcPr>
+          <w:p>
+            <w:proofErr w:type="spellStart"/>
+            <w:r>
+              <w:t>su_lane_clear</w:t>
+            </w:r>
+            <w:proofErr w:type="spellEnd"/>
+          </w:p>
+        </w:tc>
+        <w:tc>
+          <w:tcPr>
+            <w:tcW w:w="0" w:type="auto"/>
+            <w:tcBorders>
+              <w:top w:val="single" w:sz="4" w:space="0" w:color="3D444D"/>
+              <w:left w:val="single" w:sz="4" w:space="0" w:color="3D444D"/>
+              <w:bottom w:val="single" w:sz="4" w:space="0" w:color="3D444D"/>
+              <w:right w:val="single" w:sz="4" w:space="0" w:color="3D444D"/>
+            </w:tcBorders>
+            <w:shd w:val="clear" w:color="auto" w:fill="0D1117"/>
+            <w:tcMar>
+              <w:top w:w="90" w:type="dxa"/>
+              <w:left w:w="195" w:type="dxa"/>
+              <w:bottom w:w="90" w:type="dxa"/>
+              <w:right w:w="195" w:type="dxa"/>
+            </w:tcMar>
+            <w:vAlign w:val="center"/>
+            <w:hideMark/>
+          </w:tcPr>
+          <w:p>
+            <w:r>
+              <w:t>su_lane_clear.wav</w:t>
+            </w:r>
+          </w:p>
+        </w:tc>
+        <w:tc>
+          <w:tcPr>
+            <w:tcW w:w="0" w:type="auto"/>
+            <w:tcBorders>
+              <w:top w:val="single" w:sz="4" w:space="0" w:color="3D444D"/>
+              <w:left w:val="single" w:sz="4" w:space="0" w:color="3D444D"/>
+              <w:bottom w:val="single" w:sz="4" w:space="0" w:color="3D444D"/>
+              <w:right w:val="single" w:sz="4" w:space="0" w:color="3D444D"/>
+            </w:tcBorders>
+            <w:shd w:val="clear" w:color="auto" w:fill="0D1117"/>
+            <w:tcMar>
+              <w:top w:w="90" w:type="dxa"/>
+              <w:left w:w="195" w:type="dxa"/>
+              <w:bottom w:w="90" w:type="dxa"/>
+              <w:right w:w="195" w:type="dxa"/>
+            </w:tcMar>
+            <w:vAlign w:val="center"/>
+            <w:hideMark/>
+          </w:tcPr>
+          <w:p>
+            <w:r>
+              <w:t>Snake exits lane (reached end)</w:t>
+            </w:r>
+          </w:p>
+        </w:tc>
+      </w:tr>
+      <w:tr>
+        <w:tc>
+          <w:tcPr>
+            <w:tcW w:w="0" w:type="auto"/>
+            <w:tcBorders>
+              <w:top w:val="single" w:sz="4" w:space="0" w:color="3D444D"/>
+              <w:left w:val="single" w:sz="4" w:space="0" w:color="3D444D"/>
+              <w:bottom w:val="single" w:sz="4" w:space="0" w:color="3D444D"/>
+              <w:right w:val="single" w:sz="4" w:space="0" w:color="3D444D"/>
+            </w:tcBorders>
+            <w:shd w:val="clear" w:color="auto" w:fill="151B23"/>
+            <w:tcMar>
+              <w:top w:w="90" w:type="dxa"/>
+              <w:left w:w="195" w:type="dxa"/>
+              <w:bottom w:w="90" w:type="dxa"/>
+              <w:right w:w="195" w:type="dxa"/>
+            </w:tcMar>
+            <w:vAlign w:val="center"/>
+            <w:hideMark/>
+          </w:tcPr>
+          <w:p>
+            <w:proofErr w:type="spellStart"/>
+            <w:r>
+              <w:t>su_snake_grow</w:t>
+            </w:r>
+            <w:proofErr w:type="spellEnd"/>
+          </w:p>
+        </w:tc>
+        <w:tc>
+          <w:tcPr>
+            <w:tcW w:w="0" w:type="auto"/>
+            <w:tcBorders>
+              <w:top w:val="single" w:sz="4" w:space="0" w:color="3D444D"/>
+              <w:left w:val="single" w:sz="4" w:space="0" w:color="3D444D"/>
+              <w:bottom w:val="single" w:sz="4" w:space="0" w:color="3D444D"/>
+              <w:right w:val="single" w:sz="4" w:space="0" w:color="3D444D"/>
+            </w:tcBorders>
+            <w:shd w:val="clear" w:color="auto" w:fill="151B23"/>
+            <w:tcMar>
+              <w:top w:w="90" w:type="dxa"/>
+              <w:left w:w="195" w:type="dxa"/>
+              <w:bottom w:w="90" w:type="dxa"/>
+              <w:right w:w="195" w:type="dxa"/>
+            </w:tcMar>
+            <w:vAlign w:val="center"/>
+            <w:hideMark/>
+          </w:tcPr>
+          <w:p>
+            <w:r>
+              <w:t>su_snake_grow.wav</w:t>
+            </w:r>
+          </w:p>
+        </w:tc>
+        <w:tc>
+          <w:tcPr>
+            <w:tcW w:w="0" w:type="auto"/>
+            <w:tcBorders>
+              <w:top w:val="single" w:sz="4" w:space="0" w:color="3D444D"/>
+              <w:left w:val="single" w:sz="4" w:space="0" w:color="3D444D"/>
+              <w:bottom w:val="single" w:sz="4" w:space="0" w:color="3D444D"/>
+              <w:right w:val="single" w:sz="4" w:space="0" w:color="3D444D"/>
+            </w:tcBorders>
+            <w:shd w:val="clear" w:color="auto" w:fill="151B23"/>
+            <w:tcMar>
+              <w:top w:w="90" w:type="dxa"/>
+              <w:left w:w="195" w:type="dxa"/>
+              <w:bottom w:w="90" w:type="dxa"/>
+              <w:right w:w="195" w:type="dxa"/>
+            </w:tcMar>
+            <w:vAlign w:val="center"/>
+            <w:hideMark/>
+          </w:tcPr>
+          <w:p>
+            <w:r>
+              <w:t>Snake grows</w:t>
+            </w:r>
+          </w:p>
+        </w:tc>
+      </w:tr>
+      <w:tr>
+        <w:tc>
+          <w:tcPr>
+            <w:tcW w:w="0" w:type="auto"/>
+            <w:tcBorders>
+              <w:top w:val="single" w:sz="4" w:space="0" w:color="3D444D"/>
+              <w:left w:val="single" w:sz="4" w:space="0" w:color="3D444D"/>
+              <w:bottom w:val="single" w:sz="4" w:space="0" w:color="3D444D"/>
+              <w:right w:val="single" w:sz="4" w:space="0" w:color="3D444D"/>
+            </w:tcBorders>
+            <w:shd w:val="clear" w:color="auto" w:fill="0D1117"/>
+            <w:tcMar>
+              <w:top w:w="90" w:type="dxa"/>
+              <w:left w:w="195" w:type="dxa"/>
+              <w:bottom w:w="90" w:type="dxa"/>
+              <w:right w:w="195" w:type="dxa"/>
+            </w:tcMar>
+            <w:vAlign w:val="center"/>
+            <w:hideMark/>
+          </w:tcPr>
+          <w:p>
+            <w:proofErr w:type="spellStart"/>
+            <w:r>
+              <w:t>su_snake_warning</w:t>
+            </w:r>
+            <w:proofErr w:type="spellEnd"/>
+          </w:p>
+        </w:tc>
+        <w:tc>
+          <w:tcPr>
+            <w:tcW w:w="0" w:type="auto"/>
+            <w:tcBorders>
+              <w:top w:val="single" w:sz="4" w:space="0" w:color="3D444D"/>
+              <w:left w:val="single" w:sz="4" w:space="0" w:color="3D444D"/>
+              <w:bottom w:val="single" w:sz="4" w:space="0" w:color="3D444D"/>
+              <w:right w:val="single" w:sz="4" w:space="0" w:color="3D444D"/>
+            </w:tcBorders>
+            <w:shd w:val="clear" w:color="auto" w:fill="0D1117"/>
+            <w:tcMar>
+              <w:top w:w="90" w:type="dxa"/>
+              <w:left w:w="195" w:type="dxa"/>
+              <w:bottom w:w="90" w:type="dxa"/>
+              <w:right w:w="195" w:type="dxa"/>
+            </w:tcMar>
+            <w:vAlign w:val="center"/>
+            <w:hideMark/>
+          </w:tcPr>
+          <w:p>
+            <w:r>
+              <w:t>su_snake_warning.wav</w:t>
+            </w:r>
+          </w:p>
+        </w:tc>
+        <w:tc>
+          <w:tcPr>
+            <w:tcW w:w="0" w:type="auto"/>
+            <w:tcBorders>
+              <w:top w:val="single" w:sz="4" w:space="0" w:color="3D444D"/>
+              <w:left w:val="single" w:sz="4" w:space="0" w:color="3D444D"/>
+              <w:bottom w:val="single" w:sz="4" w:space="0" w:color="3D444D"/>
+              <w:right w:val="single" w:sz="4" w:space="0" w:color="3D444D"/>
+            </w:tcBorders>
+            <w:shd w:val="clear" w:color="auto" w:fill="0D1117"/>
+            <w:tcMar>
+              <w:top w:w="90" w:type="dxa"/>
+              <w:left w:w="195" w:type="dxa"/>
+              <w:bottom w:w="90" w:type="dxa"/>
+              <w:right w:w="195" w:type="dxa"/>
+            </w:tcMar>
+            <w:vAlign w:val="center"/>
+            <w:hideMark/>
+          </w:tcPr>
+          <w:p>
+            <w:r>
+              <w:t>Snake near player zone</w:t>
+            </w:r>
+          </w:p>
+        </w:tc>
+      </w:tr>
+      <w:tr>
+        <w:tc>
+          <w:tcPr>
+            <w:tcW w:w="0" w:type="auto"/>
+            <w:tcBorders>
+              <w:top w:val="single" w:sz="4" w:space="0" w:color="3D444D"/>
+              <w:left w:val="single" w:sz="4" w:space="0" w:color="3D444D"/>
+              <w:bottom w:val="single" w:sz="4" w:space="0" w:color="3D444D"/>
+              <w:right w:val="single" w:sz="4" w:space="0" w:color="3D444D"/>
+            </w:tcBorders>
+            <w:shd w:val="clear" w:color="auto" w:fill="151B23"/>
+            <w:tcMar>
+              <w:top w:w="90" w:type="dxa"/>
+              <w:left w:w="195" w:type="dxa"/>
+              <w:bottom w:w="90" w:type="dxa"/>
+              <w:right w:w="195" w:type="dxa"/>
+            </w:tcMar>
+            <w:vAlign w:val="center"/>
+            <w:hideMark/>
+          </w:tcPr>
+          <w:p>
+            <w:proofErr w:type="spellStart"/>
+            <w:r>
+              <w:t>su_snake_reached_end</w:t>
+            </w:r>
+            <w:proofErr w:type="spellEnd"/>
+          </w:p>
+        </w:tc>
+        <w:tc>
+          <w:tcPr>
+            <w:tcW w:w="0" w:type="auto"/>
+            <w:tcBorders>
+              <w:top w:val="single" w:sz="4" w:space="0" w:color="3D444D"/>
+              <w:left w:val="single" w:sz="4" w:space="0" w:color="3D444D"/>
+              <w:bottom w:val="single" w:sz="4" w:space="0" w:color="3D444D"/>
+              <w:right w:val="single" w:sz="4" w:space="0" w:color="3D444D"/>
+            </w:tcBorders>
+            <w:shd w:val="clear" w:color="auto" w:fill="151B23"/>
+            <w:tcMar>
+              <w:top w:w="90" w:type="dxa"/>
+              <w:left w:w="195" w:type="dxa"/>
+              <w:bottom w:w="90" w:type="dxa"/>
+              <w:right w:w="195" w:type="dxa"/>
+            </w:tcMar>
+            <w:vAlign w:val="center"/>
+            <w:hideMark/>
+          </w:tcPr>
+          <w:p>
+            <w:r>
+              <w:t>su_snake_reached_end.wav</w:t>
+            </w:r>
+          </w:p>
+        </w:tc>
+        <w:tc>
+          <w:tcPr>
+            <w:tcW w:w="0" w:type="auto"/>
+            <w:tcBorders>
+              <w:top w:val="single" w:sz="4" w:space="0" w:color="3D444D"/>
+              <w:left w:val="single" w:sz="4" w:space="0" w:color="3D444D"/>
+              <w:bottom w:val="single" w:sz="4" w:space="0" w:color="3D444D"/>
+              <w:right w:val="single" w:sz="4" w:space="0" w:color="3D444D"/>
+            </w:tcBorders>
+            <w:shd w:val="clear" w:color="auto" w:fill="151B23"/>
+            <w:tcMar>
+              <w:top w:w="90" w:type="dxa"/>
+              <w:left w:w="195" w:type="dxa"/>
+              <w:bottom w:w="90" w:type="dxa"/>
+              <w:right w:w="195" w:type="dxa"/>
+            </w:tcMar>
+            <w:vAlign w:val="center"/>
+            <w:hideMark/>
+          </w:tcPr>
+          <w:p>
+            <w:r>
+              <w:t>Snake fully exits field</w:t>
+            </w:r>
+          </w:p>
+        </w:tc>
+      </w:tr>
+      <w:tr>
+        <w:tc>
+          <w:tcPr>
+            <w:tcW w:w="0" w:type="auto"/>
+            <w:tcBorders>
+              <w:top w:val="single" w:sz="4" w:space="0" w:color="3D444D"/>
+              <w:left w:val="single" w:sz="4" w:space="0" w:color="3D444D"/>
+              <w:bottom w:val="single" w:sz="4" w:space="0" w:color="3D444D"/>
+              <w:right w:val="single" w:sz="4" w:space="0" w:color="3D444D"/>
+            </w:tcBorders>
+            <w:shd w:val="clear" w:color="auto" w:fill="0D1117"/>
+            <w:tcMar>
+              <w:top w:w="90" w:type="dxa"/>
+              <w:left w:w="195" w:type="dxa"/>
+              <w:bottom w:w="90" w:type="dxa"/>
+              <w:right w:w="195" w:type="dxa"/>
+            </w:tcMar>
+            <w:vAlign w:val="center"/>
+            <w:hideMark/>
+          </w:tcPr>
+          <w:p>
+            <w:proofErr w:type="spellStart"/>
+            <w:r>
+              <w:t>su_round_start</w:t>
+            </w:r>
+            <w:proofErr w:type="spellEnd"/>
+          </w:p>
+        </w:tc>
+        <w:tc>
+          <w:tcPr>
+            <w:tcW w:w="0" w:type="auto"/>
+            <w:tcBorders>
+              <w:top w:val="single" w:sz="4" w:space="0" w:color="3D444D"/>
+              <w:left w:val="single" w:sz="4" w:space="0" w:color="3D444D"/>
+              <w:bottom w:val="single" w:sz="4" w:space="0" w:color="3D444D"/>
+              <w:right w:val="single" w:sz="4" w:space="0" w:color="3D444D"/>
+            </w:tcBorders>
+            <w:shd w:val="clear" w:color="auto" w:fill="0D1117"/>
+            <w:tcMar>
+              <w:top w:w="90" w:type="dxa"/>
+              <w:left w:w="195" w:type="dxa"/>
+              <w:bottom w:w="90" w:type="dxa"/>
+              <w:right w:w="195" w:type="dxa"/>
+            </w:tcMar>
+            <w:vAlign w:val="center"/>
+            <w:hideMark/>
+          </w:tcPr>
+          <w:p>
+            <w:r>
+              <w:t>su_round_start.ogg</w:t>
+            </w:r>
+          </w:p>
+        </w:tc>
+        <w:tc>
+          <w:tcPr>
+            <w:tcW w:w="0" w:type="auto"/>
+            <w:tcBorders>
+              <w:top w:val="single" w:sz="4" w:space="0" w:color="3D444D"/>
+              <w:left w:val="single" w:sz="4" w:space="0" w:color="3D444D"/>
+              <w:bottom w:val="single" w:sz="4" w:space="0" w:color="3D444D"/>
+              <w:right w:val="single" w:sz="4" w:space="0" w:color="3D444D"/>
+            </w:tcBorders>
+            <w:shd w:val="clear" w:color="auto" w:fill="0D1117"/>
+            <w:tcMar>
+              <w:top w:w="90" w:type="dxa"/>
+              <w:left w:w="195" w:type="dxa"/>
+              <w:bottom w:w="90" w:type="dxa"/>
+              <w:right w:w="195" w:type="dxa"/>
+            </w:tcMar>
+            <w:vAlign w:val="center"/>
+            <w:hideMark/>
+          </w:tcPr>
+          <w:p>
+            <w:r>
+              <w:t>Round begins</w:t>
+            </w:r>
+          </w:p>
+        </w:tc>
+      </w:tr>
+      <w:tr>
+        <w:tc>
+          <w:tcPr>
+            <w:tcW w:w="0" w:type="auto"/>
+            <w:tcBorders>
+              <w:top w:val="single" w:sz="4" w:space="0" w:color="3D444D"/>
+              <w:left w:val="single" w:sz="4" w:space="0" w:color="3D444D"/>
+              <w:bottom w:val="single" w:sz="4" w:space="0" w:color="3D444D"/>
+              <w:right w:val="single" w:sz="4" w:space="0" w:color="3D444D"/>
+            </w:tcBorders>
+            <w:shd w:val="clear" w:color="auto" w:fill="151B23"/>
+            <w:tcMar>
+              <w:top w:w="90" w:type="dxa"/>
+              <w:left w:w="195" w:type="dxa"/>
+              <w:bottom w:w="90" w:type="dxa"/>
+              <w:right w:w="195" w:type="dxa"/>
+            </w:tcMar>
+            <w:vAlign w:val="center"/>
+            <w:hideMark/>
+          </w:tcPr>
+          <w:p>
+            <w:proofErr w:type="spellStart"/>
+            <w:r>
+              <w:t>su_round_end</w:t>
+            </w:r>
+            <w:proofErr w:type="spellEnd"/>
+          </w:p>
+        </w:tc>
+        <w:tc>
+          <w:tcPr>
+            <w:tcW w:w="0" w:type="auto"/>
+            <w:tcBorders>
+              <w:top w:val="single" w:sz="4" w:space="0" w:color="3D444D"/>
+              <w:left w:val="single" w:sz="4" w:space="0" w:color="3D444D"/>
+              <w:bottom w:val="single" w:sz="4" w:space="0" w:color="3D444D"/>
+              <w:right w:val="single" w:sz="4" w:space="0" w:color="3D444D"/>
+            </w:tcBorders>
+            <w:shd w:val="clear" w:color="auto" w:fill="151B23"/>
+            <w:tcMar>
+              <w:top w:w="90" w:type="dxa"/>
+              <w:left w:w="195" w:type="dxa"/>
+              <w:bottom w:w="90" w:type="dxa"/>
+              <w:right w:w="195" w:type="dxa"/>
+            </w:tcMar>
+            <w:vAlign w:val="center"/>
+            <w:hideMark/>
+          </w:tcPr>
+          <w:p>
+            <w:r>
+              <w:t>su_round_end.ogg</w:t>
+            </w:r>
+          </w:p>
+        </w:tc>
+        <w:tc>
+          <w:tcPr>
+            <w:tcW w:w="0" w:type="auto"/>
+            <w:tcBorders>
+              <w:top w:val="single" w:sz="4" w:space="0" w:color="3D444D"/>
+              <w:left w:val="single" w:sz="4" w:space="0" w:color="3D444D"/>
+              <w:bottom w:val="single" w:sz="4" w:space="0" w:color="3D444D"/>
+              <w:right w:val="single" w:sz="4" w:space="0" w:color="3D444D"/>
+            </w:tcBorders>
+            <w:shd w:val="clear" w:color="auto" w:fill="151B23"/>
+            <w:tcMar>
+              <w:top w:w="90" w:type="dxa"/>
+              <w:left w:w="195" w:type="dxa"/>
+              <w:bottom w:w="90" w:type="dxa"/>
+              <w:right w:w="195" w:type="dxa"/>
+            </w:tcMar>
+            <w:vAlign w:val="center"/>
+            <w:hideMark/>
+          </w:tcPr>
+          <w:p>
+            <w:r>
+              <w:t>Round ends</w:t>
+            </w:r>
+          </w:p>
+        </w:tc>
+      </w:tr>
+      <w:tr>
+        <w:tc>
+          <w:tcPr>
+            <w:tcW w:w="0" w:type="auto"/>
+            <w:tcBorders>
+              <w:top w:val="single" w:sz="4" w:space="0" w:color="3D444D"/>
+              <w:left w:val="single" w:sz="4" w:space="0" w:color="3D444D"/>
+              <w:bottom w:val="single" w:sz="4" w:space="0" w:color="3D444D"/>
+              <w:right w:val="single" w:sz="4" w:space="0" w:color="3D444D"/>
+            </w:tcBorders>
+            <w:shd w:val="clear" w:color="auto" w:fill="0D1117"/>
+            <w:tcMar>
+              <w:top w:w="90" w:type="dxa"/>
+              <w:left w:w="195" w:type="dxa"/>
+              <w:bottom w:w="90" w:type="dxa"/>
+              <w:right w:w="195" w:type="dxa"/>
+            </w:tcMar>
+            <w:vAlign w:val="center"/>
+            <w:hideMark/>
+          </w:tcPr>
+          <w:p>
+            <w:proofErr w:type="spellStart"/>
+            <w:r>
+              <w:t>su_bonus_start</w:t>
+            </w:r>
+            <w:proofErr w:type="spellEnd"/>
+          </w:p>
+        </w:tc>
+        <w:tc>
+          <w:tcPr>
+            <w:tcW w:w="0" w:type="auto"/>
+            <w:tcBorders>
+              <w:top w:val="single" w:sz="4" w:space="0" w:color="3D444D"/>
+              <w:left w:val="single" w:sz="4" w:space="0" w:color="3D444D"/>
+              <w:bottom w:val="single" w:sz="4" w:space="0" w:color="3D444D"/>
+              <w:right w:val="single" w:sz="4" w:space="0" w:color="3D444D"/>
+            </w:tcBorders>
+            <w:shd w:val="clear" w:color="auto" w:fill="0D1117"/>
+            <w:tcMar>
+              <w:top w:w="90" w:type="dxa"/>
+              <w:left w:w="195" w:type="dxa"/>
+              <w:bottom w:w="90" w:type="dxa"/>
+              <w:right w:w="195" w:type="dxa"/>
+            </w:tcMar>
+            <w:vAlign w:val="center"/>
+            <w:hideMark/>
+          </w:tcPr>
+          <w:p>
+            <w:r>
+              <w:t>su_bonus_start.ogg</w:t>
+            </w:r>
+          </w:p>
+        </w:tc>
+        <w:tc>
+          <w:tcPr>
+            <w:tcW w:w="0" w:type="auto"/>
+            <w:tcBorders>
+              <w:top w:val="single" w:sz="4" w:space="0" w:color="3D444D"/>
+              <w:left w:val="single" w:sz="4" w:space="0" w:color="3D444D"/>
+              <w:bottom w:val="single" w:sz="4" w:space="0" w:color="3D444D"/>
+              <w:right w:val="single" w:sz="4" w:space="0" w:color="3D444D"/>
+            </w:tcBorders>
+            <w:shd w:val="clear" w:color="auto" w:fill="0D1117"/>
+            <w:tcMar>
+              <w:top w:w="90" w:type="dxa"/>
+              <w:left w:w="195" w:type="dxa"/>
+              <w:bottom w:w="90" w:type="dxa"/>
+              <w:right w:w="195" w:type="dxa"/>
+            </w:tcMar>
+            <w:vAlign w:val="center"/>
+            <w:hideMark/>
+          </w:tcPr>
+          <w:p>
+            <w:r>
+              <w:t>Bonus mode starts</w:t>
+            </w:r>
+          </w:p>
+        </w:tc>
+      </w:tr>
+      <w:tr>
+        <w:tc>
+          <w:tcPr>
+            <w:tcW w:w="0" w:type="auto"/>
+            <w:tcBorders>
+              <w:top w:val="single" w:sz="4" w:space="0" w:color="3D444D"/>
+              <w:left w:val="single" w:sz="4" w:space="0" w:color="3D444D"/>
+              <w:bottom w:val="single" w:sz="4" w:space="0" w:color="3D444D"/>
+              <w:right w:val="single" w:sz="4" w:space="0" w:color="3D444D"/>
+            </w:tcBorders>
+            <w:shd w:val="clear" w:color="auto" w:fill="151B23"/>
+            <w:tcMar>
+              <w:top w:w="90" w:type="dxa"/>
+              <w:left w:w="195" w:type="dxa"/>
+              <w:bottom w:w="90" w:type="dxa"/>
+              <w:right w:w="195" w:type="dxa"/>
+            </w:tcMar>
+            <w:vAlign w:val="center"/>
+            <w:hideMark/>
+          </w:tcPr>
+          <w:p>
+            <w:proofErr w:type="spellStart"/>
+            <w:r>
+              <w:t>su_bonus_end</w:t>
+            </w:r>
+            <w:proofErr w:type="spellEnd"/>
+          </w:p>
+        </w:tc>
+        <w:tc>
+          <w:tcPr>
+            <w:tcW w:w="0" w:type="auto"/>
+            <w:tcBorders>
+              <w:top w:val="single" w:sz="4" w:space="0" w:color="3D444D"/>
+              <w:left w:val="single" w:sz="4" w:space="0" w:color="3D444D"/>
+              <w:bottom w:val="single" w:sz="4" w:space="0" w:color="3D444D"/>
+              <w:right w:val="single" w:sz="4" w:space="0" w:color="3D444D"/>
+            </w:tcBorders>
+            <w:shd w:val="clear" w:color="auto" w:fill="151B23"/>
+            <w:tcMar>
+              <w:top w:w="90" w:type="dxa"/>
+              <w:left w:w="195" w:type="dxa"/>
+              <w:bottom w:w="90" w:type="dxa"/>
+              <w:right w:w="195" w:type="dxa"/>
+            </w:tcMar>
+            <w:vAlign w:val="center"/>
+            <w:hideMark/>
+          </w:tcPr>
+          <w:p>
+            <w:r>
+              <w:t>su_bonus_end.ogg</w:t>
+            </w:r>
+          </w:p>
+        </w:tc>
+        <w:tc>
+          <w:tcPr>
+            <w:tcW w:w="0" w:type="auto"/>
+            <w:tcBorders>
+              <w:top w:val="single" w:sz="4" w:space="0" w:color="3D444D"/>
+              <w:left w:val="single" w:sz="4" w:space="0" w:color="3D444D"/>
+              <w:bottom w:val="single" w:sz="4" w:space="0" w:color="3D444D"/>
+              <w:right w:val="single" w:sz="4" w:space="0" w:color="3D444D"/>
+            </w:tcBorders>
+            <w:shd w:val="clear" w:color="auto" w:fill="151B23"/>
+            <w:tcMar>
+              <w:top w:w="90" w:type="dxa"/>
+              <w:left w:w="195" w:type="dxa"/>
+              <w:bottom w:w="90" w:type="dxa"/>
+              <w:right w:w="195" w:type="dxa"/>
+            </w:tcMar>
+            <w:vAlign w:val="center"/>
+            <w:hideMark/>
+          </w:tcPr>
+          <w:p>
+            <w:r>
+              <w:t>Bonus mode ends</w:t>
+            </w:r>
+          </w:p>
+        </w:tc>
+      </w:tr>
+      <w:tr>
+        <w:tc>
+          <w:tcPr>
+            <w:tcW w:w="0" w:type="auto"/>
+            <w:tcBorders>
+              <w:top w:val="single" w:sz="4" w:space="0" w:color="3D444D"/>
+              <w:left w:val="single" w:sz="4" w:space="0" w:color="3D444D"/>
+              <w:bottom w:val="single" w:sz="4" w:space="0" w:color="3D444D"/>
+              <w:right w:val="single" w:sz="4" w:space="0" w:color="3D444D"/>
+            </w:tcBorders>
+            <w:shd w:val="clear" w:color="auto" w:fill="0D1117"/>
+            <w:tcMar>
+              <w:top w:w="90" w:type="dxa"/>
+              <w:left w:w="195" w:type="dxa"/>
+              <w:bottom w:w="90" w:type="dxa"/>
+              <w:right w:w="195" w:type="dxa"/>
+            </w:tcMar>
+            <w:vAlign w:val="center"/>
+            <w:hideMark/>
+          </w:tcPr>
+          <w:p>
+            <w:proofErr w:type="spellStart"/>
+            <w:r>
+              <w:t>su_music_gameplay</w:t>
+            </w:r>
+            <w:proofErr w:type="spellEnd"/>
+          </w:p>
+        </w:tc>
+        <w:tc>
+          <w:tcPr>
+            <w:tcW w:w="0" w:type="auto"/>
+            <w:tcBorders>
+              <w:top w:val="single" w:sz="4" w:space="0" w:color="3D444D"/>
+              <w:left w:val="single" w:sz="4" w:space="0" w:color="3D444D"/>
+              <w:bottom w:val="single" w:sz="4" w:space="0" w:color="3D444D"/>
+              <w:right w:val="single" w:sz="4" w:space="0" w:color="3D444D"/>
+            </w:tcBorders>
+            <w:shd w:val="clear" w:color="auto" w:fill="0D1117"/>
+            <w:tcMar>
+              <w:top w:w="90" w:type="dxa"/>
+              <w:left w:w="195" w:type="dxa"/>
+              <w:bottom w:w="90" w:type="dxa"/>
+              <w:right w:w="195" w:type="dxa"/>
+            </w:tcMar>
+            <w:vAlign w:val="center"/>
+            <w:hideMark/>
+          </w:tcPr>
+          <w:p>
+            <w:r>
+              <w:t>su_music_gameplay.ogg</w:t>
+            </w:r>
+          </w:p>
+        </w:tc>
+        <w:tc>
+          <w:tcPr>
+            <w:tcW w:w="0" w:type="auto"/>
+            <w:tcBorders>
+              <w:top w:val="single" w:sz="4" w:space="0" w:color="3D444D"/>
+              <w:left w:val="single" w:sz="4" w:space="0" w:color="3D444D"/>
+              <w:bottom w:val="single" w:sz="4" w:space="0" w:color="3D444D"/>
+              <w:right w:val="single" w:sz="4" w:space="0" w:color="3D444D"/>
+            </w:tcBorders>
+            <w:shd w:val="clear" w:color="auto" w:fill="0D1117"/>
+            <w:tcMar>
+              <w:top w:w="90" w:type="dxa"/>
+              <w:left w:w="195" w:type="dxa"/>
+              <w:bottom w:w="90" w:type="dxa"/>
+              <w:right w:w="195" w:type="dxa"/>
+            </w:tcMar>
+            <w:vAlign w:val="center"/>
+            <w:hideMark/>
+          </w:tcPr>
+          <w:p>
+            <w:r>
+              <w:t>Background music loop</w:t>
+            </w:r>
+          </w:p>
+        </w:tc>
+      </w:tr>
+    </w:tbl>
+    <w:p>
+      <w:r>
+        <w:rPr>
+          <w:b/>
+          <w:bCs/>
+        </w:rPr>
+        <w:t>Note:</w:t>
+      </w:r>
+      <w:r>
+        <w:t> Most of these are 0-byte placeholders right now. The code will gracefully skip them (the console's </w:t>
+      </w:r>
+      <w:proofErr w:type="spellStart"/>
+      <w:r>
+        <w:t>play_sound</w:t>
+      </w:r>
+      <w:proofErr w:type="spellEnd"/>
+      <w:r>
+        <w:t> already checks </w:t>
+      </w:r>
+      <w:proofErr w:type="spellStart"/>
+      <w:proofErr w:type="gramStart"/>
+      <w:r>
+        <w:t>os.path</w:t>
+      </w:r>
+      <w:proofErr w:type="gramEnd"/>
+      <w:r>
+        <w:t>.exists</w:t>
+      </w:r>
+      <w:proofErr w:type="spellEnd"/>
+      <w:r>
+        <w:t> and file size). Once you drop real .wav/.</w:t>
+      </w:r>
+      <w:proofErr w:type="spellStart"/>
+      <w:r>
+        <w:t>ogg</w:t>
+      </w:r>
+      <w:proofErr w:type="spellEnd"/>
+      <w:r>
+        <w:t> files in, they'll play automatically.</w:t>
+      </w:r>
+    </w:p>
+    <w:p/>
     <w:p/>
     <w:p>
       <w:pPr>

</xml_diff>